<commit_message>
fix: make calleInmueble and limites conditional in boleto template
If calle or limites are empty, the phrases 'con frente a la calle' and
'entre las de' are omitted from the generated boleto.

Co-Authored-By: Claude Sonnet 4.6 <noreply@anthropic.com>
</commit_message>
<xml_diff>
--- a/src/templates/boleto-template.docx
+++ b/src/templates/boleto-template.docx
@@ -738,37 +738,37 @@
           <w:szCs w:val="24"/>
           <w:lang w:val="es-ES_tradnl"/>
         </w:rPr>
-        <w:t xml:space="preserve">, con frente a la calle </w:t>
-      </w:r>
-      <w:r>
-        <w:rPr>
-          <w:rFonts w:ascii="Times New Roman" w:hAnsi="Times New Roman" w:cs="Times New Roman"/>
-          <w:color w:val="000000"/>
-          <w:sz w:val="24"/>
-          <w:szCs w:val="24"/>
-          <w:lang w:val="es-ES_tradnl"/>
-        </w:rPr>
-        <w:t>{calleInmueble}</w:t>
-      </w:r>
-      <w:r>
-        <w:rPr>
-          <w:rFonts w:ascii="Times New Roman" w:hAnsi="Times New Roman" w:cs="Times New Roman"/>
-          <w:color w:val="000000"/>
-          <w:sz w:val="24"/>
-          <w:szCs w:val="24"/>
-          <w:lang w:val="es-ES_tradnl"/>
-        </w:rPr>
-        <w:t xml:space="preserve">, entre las de </w:t>
-      </w:r>
-      <w:r>
-        <w:rPr>
-          <w:rFonts w:ascii="Times New Roman" w:hAnsi="Times New Roman" w:cs="Times New Roman"/>
-          <w:color w:val="000000"/>
-          <w:sz w:val="24"/>
-          <w:szCs w:val="24"/>
-          <w:lang w:val="es-ES_tradnl"/>
-        </w:rPr>
-        <w:t>{limites}</w:t>
+        <w:t xml:space="preserve">{#calleInmueble}, con frente a la calle {calleInmueble}{/calleInmueble}</w:t>
+      </w:r>
+      <w:r>
+        <w:rPr>
+          <w:rFonts w:ascii="Times New Roman" w:hAnsi="Times New Roman" w:cs="Times New Roman"/>
+          <w:color w:val="000000"/>
+          <w:sz w:val="24"/>
+          <w:szCs w:val="24"/>
+          <w:lang w:val="es-ES_tradnl"/>
+        </w:rPr>
+        <w:t/>
+      </w:r>
+      <w:r>
+        <w:rPr>
+          <w:rFonts w:ascii="Times New Roman" w:hAnsi="Times New Roman" w:cs="Times New Roman"/>
+          <w:color w:val="000000"/>
+          <w:sz w:val="24"/>
+          <w:szCs w:val="24"/>
+          <w:lang w:val="es-ES_tradnl"/>
+        </w:rPr>
+        <w:t xml:space="preserve">{#limites}, entre las de {limites}{/limites}</w:t>
+      </w:r>
+      <w:r>
+        <w:rPr>
+          <w:rFonts w:ascii="Times New Roman" w:hAnsi="Times New Roman" w:cs="Times New Roman"/>
+          <w:color w:val="000000"/>
+          <w:sz w:val="24"/>
+          <w:szCs w:val="24"/>
+          <w:lang w:val="es-ES_tradnl"/>
+        </w:rPr>
+        <w:t/>
       </w:r>
       <w:r>
         <w:rPr>

</xml_diff>

<commit_message>
feat: add cuotas/sin-cuotas conditional to boleto saldo clause
If cantidadCuotas is filled, the boleto uses the installment text
('en X cuotas mensuales...'); otherwise uses the original escritura text.
Adds cuotaMensualPalabras field to the dialog.

Co-Authored-By: Claude Sonnet 4.6 <noreply@anthropic.com>
</commit_message>
<xml_diff>
--- a/src/templates/boleto-template.docx
+++ b/src/templates/boleto-template.docx
@@ -1920,119 +1920,27 @@
           <w:szCs w:val="24"/>
           <w:lang w:val="es-ES_tradnl"/>
         </w:rPr>
-        <w:t xml:space="preserve"> serán abonados por </w:t>
-      </w:r>
-      <w:r>
-        <w:rPr>
-          <w:rFonts w:ascii="Times New Roman" w:hAnsi="Times New Roman" w:cs="Times New Roman"/>
-          <w:sz w:val="24"/>
-          <w:szCs w:val="24"/>
-          <w:lang w:val="es-ES_tradnl"/>
-        </w:rPr>
-        <w:t xml:space="preserve">la </w:t>
-      </w:r>
-      <w:r>
-        <w:rPr>
-          <w:rFonts w:ascii="Times New Roman" w:hAnsi="Times New Roman" w:cs="Times New Roman"/>
-          <w:b/>
-          <w:bCs/>
-          <w:sz w:val="24"/>
-          <w:szCs w:val="24"/>
-          <w:lang w:val="es-ES_tradnl"/>
-        </w:rPr>
-        <w:t>PARTE COMPRADORA</w:t>
-      </w:r>
-      <w:r>
-        <w:rPr>
-          <w:rFonts w:ascii="Times New Roman" w:hAnsi="Times New Roman" w:cs="Times New Roman"/>
-          <w:color w:val="000000"/>
-          <w:sz w:val="24"/>
-          <w:szCs w:val="24"/>
-          <w:lang w:val="es-ES_tradnl"/>
-        </w:rPr>
-        <w:t xml:space="preserve"> </w:t>
-      </w:r>
-      <w:r>
-        <w:rPr>
-          <w:rFonts w:ascii="Times New Roman" w:hAnsi="Times New Roman" w:cs="Times New Roman"/>
-          <w:color w:val="000000"/>
-          <w:sz w:val="24"/>
-          <w:szCs w:val="24"/>
-          <w:lang w:val="es-ES_tradnl"/>
-        </w:rPr>
-        <w:t xml:space="preserve">a la </w:t>
-      </w:r>
-      <w:r>
-        <w:rPr>
-          <w:rFonts w:ascii="Times New Roman" w:hAnsi="Times New Roman" w:cs="Times New Roman"/>
-          <w:b/>
-          <w:bCs/>
-          <w:color w:val="000000"/>
-          <w:sz w:val="24"/>
-          <w:szCs w:val="24"/>
-          <w:lang w:val="es-ES_tradnl"/>
-        </w:rPr>
-        <w:t>PARTE VENDEDORA</w:t>
-      </w:r>
-      <w:r>
-        <w:rPr>
-          <w:rFonts w:ascii="Times New Roman" w:hAnsi="Times New Roman" w:cs="Times New Roman"/>
-          <w:color w:val="000000"/>
-          <w:sz w:val="24"/>
-          <w:szCs w:val="24"/>
-          <w:lang w:val="es-ES_tradnl"/>
-        </w:rPr>
-        <w:t xml:space="preserve"> </w:t>
-      </w:r>
-      <w:r>
-        <w:rPr>
-          <w:rFonts w:ascii="Times New Roman" w:hAnsi="Times New Roman" w:cs="Times New Roman"/>
-          <w:color w:val="000000"/>
-          <w:sz w:val="24"/>
-          <w:szCs w:val="24"/>
-          <w:lang w:val="es-ES_tradnl"/>
-        </w:rPr>
-        <w:t xml:space="preserve">en billetes de dicha moneda, en oportunidad de suscribirse la escritura traslativa de dominio, en el lugar a designar por </w:t>
-      </w:r>
-      <w:r>
-        <w:rPr>
-          <w:rFonts w:ascii="Times New Roman" w:hAnsi="Times New Roman" w:cs="Times New Roman"/>
-          <w:sz w:val="24"/>
-          <w:szCs w:val="24"/>
-          <w:lang w:val="es-ES_tradnl"/>
-        </w:rPr>
-        <w:t xml:space="preserve">la </w:t>
-      </w:r>
-      <w:r>
-        <w:rPr>
-          <w:rFonts w:ascii="Times New Roman" w:hAnsi="Times New Roman" w:cs="Times New Roman"/>
-          <w:b/>
-          <w:bCs/>
-          <w:sz w:val="24"/>
-          <w:szCs w:val="24"/>
-          <w:lang w:val="es-ES_tradnl"/>
-        </w:rPr>
-        <w:t>PARTE COMPRADORA</w:t>
-      </w:r>
-      <w:r>
-        <w:rPr>
-          <w:rFonts w:ascii="Times New Roman" w:hAnsi="Times New Roman" w:cs="Times New Roman"/>
-          <w:color w:val="000000"/>
-          <w:sz w:val="24"/>
-          <w:szCs w:val="24"/>
-          <w:lang w:val="es-ES_tradnl"/>
-        </w:rPr>
-        <w:t xml:space="preserve"> </w:t>
-      </w:r>
-      <w:r>
-        <w:rPr>
-          <w:rFonts w:ascii="Times New Roman" w:hAnsi="Times New Roman" w:cs="Times New Roman"/>
-          <w:color w:val="000000"/>
-          <w:sz w:val="24"/>
-          <w:szCs w:val="24"/>
-          <w:lang w:val="es-ES_tradnl"/>
-        </w:rPr>
-        <w:t xml:space="preserve">dentro del radio de la Ciudad Autónoma de Buenos Aires.- Ambas partes manifiestan que otorgan plena validez al pago que se efectúan mediante el presente y expresan que no tienen reclamo que formularse y renuncian a invocar las acciones establecidas en los artículos 1083 a 1088 del Código Civil y Comercial de la Nación respecto al pacto comisorio, como así también renuncian a cualquier acción que les pudiera corresponder por incumplimiento de la ley 25.345. Las partes renuncian a la facultad de arrepentimiento prevista por el artículo 1059 del mencionado Código.- </w:t>
+        <w:t xml:space="preserve"/>
+      </w:r>
+      <w:r>
+        <w:rPr>
+          <w:rFonts w:ascii="Times New Roman" w:hAnsi="Times New Roman" w:cs="Times New Roman"/>
+          <w:color w:val="000000"/>
+          <w:sz w:val="24"/>
+          <w:szCs w:val="24"/>
+          <w:lang w:val="es-ES_tradnl"/>
+        </w:rPr>
+        <w:t xml:space="preserve"> serán abonados por la PARTE COMPRADORA a la PARTE VENDEDORA en billetes de dicha moneda, {#sinCuotas}en oportunidad de suscribirse la escritura traslativa de dominio, en el lugar a designar por la PARTE COMPRADORA dentro del radio de la Ciudad Autónoma de Buenos Aires.-{/sinCuotas}{#tieneCuotas}en {cantidadCuotas} cuotas mensuales, iguales y consecutivas de DÓLARES ESTADOUNIDENSES BILLETE {cuotaMensualPalabras} (U$S {cuotaMensual}) cada una, a partir de la fecha de suscripción del presente.-{/tieneCuotas}</w:t>
+      </w:r>
+      <w:r>
+        <w:rPr>
+          <w:rFonts w:ascii="Times New Roman" w:hAnsi="Times New Roman" w:cs="Times New Roman"/>
+          <w:color w:val="000000"/>
+          <w:sz w:val="24"/>
+          <w:szCs w:val="24"/>
+          <w:lang w:val="es-ES_tradnl"/>
+        </w:rPr>
+        <w:t> Ambas partes manifiestan que otorgan plena validez al pago que se efectúan mediante el presente y expresan que no tienen reclamo que formularse y renuncian a invocar las acciones establecidas en los artículos 1083 a 1088 del Código Civil y Comercial de la Nación respecto al pacto comisorio, como así también renuncian a cualquier acción que les pudiera corresponder por incumplimiento de la ley 25.345. Las partes renuncian a la facultad de arrepentimiento prevista por el artículo 1059 del mencionado Código.- </w:t>
       </w:r>
     </w:p>
     <w:p>

</xml_diff>

<commit_message>
feat: add apoderado option to boleto form for seller representation
When generating a boleto, a checkbox now allows selecting an apoderado
for the seller party. If checked, fields for name and DNI appear, and
the generated document replaces Lazzaro's block with the company
represented by the apoderado. If unchecked, the boleto stays unchanged.

Co-Authored-By: Claude Sonnet 4.6 <noreply@anthropic.com>
</commit_message>
<xml_diff>
--- a/src/templates/boleto-template.docx
+++ b/src/templates/boleto-template.docx
@@ -22,157 +22,12 @@
       <w:r>
         <w:rPr>
           <w:rFonts w:ascii="Times New Roman" w:hAnsi="Times New Roman" w:cs="Times New Roman"/>
-          <w:b/>
-          <w:bCs/>
-          <w:color w:val="000000"/>
-          <w:sz w:val="24"/>
-          <w:szCs w:val="24"/>
-          <w:u w:val="single"/>
-          <w:lang w:val="es-ES_tradnl"/>
-        </w:rPr>
-        <w:t>BOLETO DE COMPRAVENTA</w:t>
-      </w:r>
-    </w:p>
-    <w:p>
-      <w:pPr>
-        <w:autoSpaceDE w:val="0"/>
-        <w:autoSpaceDN w:val="0"/>
-        <w:adjustRightInd w:val="0"/>
-        <w:spacing w:after="0" w:line="508" w:lineRule="exact"/>
-        <w:jc w:val="both"/>
-        <w:rPr>
-          <w:rFonts w:ascii="Times New Roman" w:hAnsi="Times New Roman" w:cs="Times New Roman"/>
-          <w:color w:val="000000"/>
-          <w:sz w:val="24"/>
-          <w:szCs w:val="24"/>
-          <w:lang w:val="es-ES_tradnl"/>
-        </w:rPr>
-      </w:pPr>
-      <w:r>
-        <w:rPr>
-          <w:rFonts w:ascii="Times New Roman" w:hAnsi="Times New Roman" w:cs="Times New Roman"/>
-          <w:color w:val="000000"/>
-          <w:sz w:val="24"/>
-          <w:szCs w:val="24"/>
-          <w:lang w:val="es-ES_tradnl"/>
-        </w:rPr>
-        <w:t xml:space="preserve">En la Ciudad Autónoma de Buenos Aires, a los </w:t>
-      </w:r>
-      <w:r>
-        <w:rPr>
-          <w:rFonts w:ascii="Times New Roman" w:hAnsi="Times New Roman" w:cs="Times New Roman"/>
-          <w:color w:val="000000"/>
-          <w:sz w:val="24"/>
-          <w:szCs w:val="24"/>
-          <w:lang w:val="es-ES_tradnl"/>
-        </w:rPr>
-        <w:t>{dia}</w:t>
-      </w:r>
-      <w:r>
-        <w:rPr>
-          <w:rFonts w:ascii="Times New Roman" w:hAnsi="Times New Roman" w:cs="Times New Roman"/>
-          <w:color w:val="000000"/>
-          <w:sz w:val="24"/>
-          <w:szCs w:val="24"/>
-          <w:lang w:val="es-ES_tradnl"/>
-        </w:rPr>
-        <w:t xml:space="preserve"> días del mes de </w:t>
-      </w:r>
-      <w:r>
-        <w:rPr>
-          <w:rFonts w:ascii="Times New Roman" w:hAnsi="Times New Roman" w:cs="Times New Roman"/>
-          <w:color w:val="000000"/>
-          <w:sz w:val="24"/>
-          <w:szCs w:val="24"/>
-          <w:lang w:val="es-ES_tradnl"/>
-        </w:rPr>
-        <w:t>{mes}</w:t>
-      </w:r>
-      <w:r>
-        <w:rPr>
-          <w:rFonts w:ascii="Times New Roman" w:hAnsi="Times New Roman" w:cs="Times New Roman"/>
-          <w:color w:val="000000"/>
-          <w:sz w:val="24"/>
-          <w:szCs w:val="24"/>
-          <w:lang w:val="es-ES_tradnl"/>
-        </w:rPr>
-        <w:t xml:space="preserve"> de {anio}, quienes suscriben, por una parte: </w:t>
-      </w:r>
-      <w:r>
-        <w:rPr>
-          <w:rFonts w:ascii="Times New Roman" w:hAnsi="Times New Roman" w:cs="Times New Roman"/>
-          <w:b/>
-          <w:bCs/>
-          <w:color w:val="000000"/>
-          <w:sz w:val="24"/>
-          <w:szCs w:val="24"/>
-          <w:lang w:val="es-ES_tradnl"/>
-        </w:rPr>
-        <w:t>1) MIGUEL ÁNGEL LÁZZARO,</w:t>
-      </w:r>
-      <w:r>
-        <w:rPr>
-          <w:rFonts w:ascii="Times New Roman" w:hAnsi="Times New Roman" w:cs="Times New Roman"/>
-          <w:color w:val="000000"/>
-          <w:sz w:val="24"/>
-          <w:szCs w:val="24"/>
-          <w:lang w:val="es-ES_tradnl"/>
-        </w:rPr>
-        <w:t xml:space="preserve"> argentino, titular del Documento Nacional de Identidad 8.206.039 y del CUIL 20-08206039-2, domiciliado en la calle Ladislao Martínez 243 Piso 2, Localidad de Martínez, Partido de San Isidro, Provincia de Buenos Aires</w:t>
-      </w:r>
-      <w:r>
-        <w:rPr>
-          <w:rFonts w:ascii="Times New Roman" w:hAnsi="Times New Roman" w:cs="Times New Roman"/>
-          <w:color w:val="000000"/>
-          <w:sz w:val="24"/>
-          <w:szCs w:val="24"/>
-          <w:lang w:val="es-ES_tradnl"/>
-        </w:rPr>
-        <w:t xml:space="preserve">, quien interviene en nombre y representación, en su carácter de </w:t>
-      </w:r>
-      <w:r>
-        <w:rPr>
-          <w:rFonts w:ascii="Times New Roman" w:hAnsi="Times New Roman" w:cs="Times New Roman"/>
-          <w:b/>
-          <w:bCs/>
-          <w:color w:val="000000"/>
-          <w:sz w:val="24"/>
-          <w:szCs w:val="24"/>
-          <w:lang w:val="es-ES_tradnl"/>
-        </w:rPr>
-        <w:t>Presidente</w:t>
-      </w:r>
-      <w:r>
-        <w:rPr>
-          <w:rFonts w:ascii="Times New Roman" w:hAnsi="Times New Roman" w:cs="Times New Roman"/>
-          <w:color w:val="000000"/>
-          <w:sz w:val="24"/>
-          <w:szCs w:val="24"/>
-          <w:lang w:val="es-ES_tradnl"/>
-        </w:rPr>
-        <w:t xml:space="preserve"> de la Sociedad que gira en esta plaza, bajo la denominación de </w:t>
-      </w:r>
-      <w:r>
-        <w:rPr>
-          <w:rFonts w:ascii="Times New Roman" w:hAnsi="Times New Roman" w:cs="Times New Roman"/>
-          <w:b/>
-          <w:bCs/>
-          <w:color w:val="000000"/>
-          <w:sz w:val="24"/>
-          <w:szCs w:val="24"/>
-          <w:lang w:val="es-ES_tradnl"/>
-        </w:rPr>
-        <w:t xml:space="preserve">“BARRIO STEFANI SOCIEDAD ANÓNIMA”, </w:t>
-      </w:r>
-      <w:r>
-        <w:rPr>
-          <w:rFonts w:ascii="Times New Roman" w:hAnsi="Times New Roman" w:cs="Times New Roman"/>
-          <w:color w:val="000000"/>
-          <w:sz w:val="24"/>
-          <w:szCs w:val="24"/>
-          <w:lang w:val="es-ES_tradnl"/>
-        </w:rPr>
-        <w:t>CUIT 30-71917882-7, con sede social en la calle Talcahuano 469, Piso 2, de ésta Ciudad</w:t>
+          <w:color w:val="000000"/>
+          <w:sz w:val="24"/>
+          <w:szCs w:val="24"/>
+          <w:lang w:val="es-ES_tradnl"/>
+        </w:rPr>
+        <w:t xml:space="preserve">{^hasApoderado}1) MIGUEL ÁNGEL LÁZZARO, argentino, titular del Documento Nacional de Identidad 8.206.039 y del CUIL 20-08206039-2, domiciliado en la calle Ladislao Martínez 243 Piso 2, Localidad de Martínez, Partido de San Isidro, Provincia de Buenos Aires, quien interviene en nombre y representación, en su carácter de Presidente de la Sociedad que gira en esta plaza, bajo la denominación de “BARRIO STEFANI SOCIEDAD ANÓNIMA”, CUIT 30-71917882-7, con sede social en la calle Talcahuano 469, Piso 2, de ésta Ciudad{/hasApoderado}{#hasApoderado}1) “BARRIO STEFANI SOCIEDAD ANÓNIMA”, CUIT 30-71917882-7, con sede social en la calle Talcahuano 469, Piso 2, de ésta Ciudad, representada en este acto por {nombreApoderado}, titular del Documento Nacional de Identidad {dniApoderado}{/hasApoderado}</w:t>
       </w:r>
       <w:r>
         <w:rPr>
@@ -738,37 +593,37 @@
           <w:szCs w:val="24"/>
           <w:lang w:val="es-ES_tradnl"/>
         </w:rPr>
-        <w:t xml:space="preserve">{#calleInmueble}, con frente a la calle {calleInmueble}{/calleInmueble}</w:t>
-      </w:r>
-      <w:r>
-        <w:rPr>
-          <w:rFonts w:ascii="Times New Roman" w:hAnsi="Times New Roman" w:cs="Times New Roman"/>
-          <w:color w:val="000000"/>
-          <w:sz w:val="24"/>
-          <w:szCs w:val="24"/>
-          <w:lang w:val="es-ES_tradnl"/>
-        </w:rPr>
-        <w:t/>
-      </w:r>
-      <w:r>
-        <w:rPr>
-          <w:rFonts w:ascii="Times New Roman" w:hAnsi="Times New Roman" w:cs="Times New Roman"/>
-          <w:color w:val="000000"/>
-          <w:sz w:val="24"/>
-          <w:szCs w:val="24"/>
-          <w:lang w:val="es-ES_tradnl"/>
-        </w:rPr>
-        <w:t xml:space="preserve">{#limites}, entre las de {limites}{/limites}</w:t>
-      </w:r>
-      <w:r>
-        <w:rPr>
-          <w:rFonts w:ascii="Times New Roman" w:hAnsi="Times New Roman" w:cs="Times New Roman"/>
-          <w:color w:val="000000"/>
-          <w:sz w:val="24"/>
-          <w:szCs w:val="24"/>
-          <w:lang w:val="es-ES_tradnl"/>
-        </w:rPr>
-        <w:t/>
+        <w:t xml:space="preserve">, con frente a la calle </w:t>
+      </w:r>
+      <w:r>
+        <w:rPr>
+          <w:rFonts w:ascii="Times New Roman" w:hAnsi="Times New Roman" w:cs="Times New Roman"/>
+          <w:color w:val="000000"/>
+          <w:sz w:val="24"/>
+          <w:szCs w:val="24"/>
+          <w:lang w:val="es-ES_tradnl"/>
+        </w:rPr>
+        <w:t>{calleInmueble}</w:t>
+      </w:r>
+      <w:r>
+        <w:rPr>
+          <w:rFonts w:ascii="Times New Roman" w:hAnsi="Times New Roman" w:cs="Times New Roman"/>
+          <w:color w:val="000000"/>
+          <w:sz w:val="24"/>
+          <w:szCs w:val="24"/>
+          <w:lang w:val="es-ES_tradnl"/>
+        </w:rPr>
+        <w:t xml:space="preserve">, entre las de </w:t>
+      </w:r>
+      <w:r>
+        <w:rPr>
+          <w:rFonts w:ascii="Times New Roman" w:hAnsi="Times New Roman" w:cs="Times New Roman"/>
+          <w:color w:val="000000"/>
+          <w:sz w:val="24"/>
+          <w:szCs w:val="24"/>
+          <w:lang w:val="es-ES_tradnl"/>
+        </w:rPr>
+        <w:t>{limites}</w:t>
       </w:r>
       <w:r>
         <w:rPr>
@@ -1920,27 +1775,119 @@
           <w:szCs w:val="24"/>
           <w:lang w:val="es-ES_tradnl"/>
         </w:rPr>
-        <w:t xml:space="preserve"/>
-      </w:r>
-      <w:r>
-        <w:rPr>
-          <w:rFonts w:ascii="Times New Roman" w:hAnsi="Times New Roman" w:cs="Times New Roman"/>
-          <w:color w:val="000000"/>
-          <w:sz w:val="24"/>
-          <w:szCs w:val="24"/>
-          <w:lang w:val="es-ES_tradnl"/>
-        </w:rPr>
-        <w:t xml:space="preserve"> serán abonados por la PARTE COMPRADORA a la PARTE VENDEDORA en billetes de dicha moneda, {#sinCuotas}en oportunidad de suscribirse la escritura traslativa de dominio, en el lugar a designar por la PARTE COMPRADORA dentro del radio de la Ciudad Autónoma de Buenos Aires.-{/sinCuotas}{#tieneCuotas}en {cantidadCuotas} cuotas mensuales, iguales y consecutivas de DÓLARES ESTADOUNIDENSES BILLETE {cuotaMensualPalabras} (U$S {cuotaMensual}) cada una, a partir de la fecha de suscripción del presente.-{/tieneCuotas}</w:t>
-      </w:r>
-      <w:r>
-        <w:rPr>
-          <w:rFonts w:ascii="Times New Roman" w:hAnsi="Times New Roman" w:cs="Times New Roman"/>
-          <w:color w:val="000000"/>
-          <w:sz w:val="24"/>
-          <w:szCs w:val="24"/>
-          <w:lang w:val="es-ES_tradnl"/>
-        </w:rPr>
-        <w:t> Ambas partes manifiestan que otorgan plena validez al pago que se efectúan mediante el presente y expresan que no tienen reclamo que formularse y renuncian a invocar las acciones establecidas en los artículos 1083 a 1088 del Código Civil y Comercial de la Nación respecto al pacto comisorio, como así también renuncian a cualquier acción que les pudiera corresponder por incumplimiento de la ley 25.345. Las partes renuncian a la facultad de arrepentimiento prevista por el artículo 1059 del mencionado Código.- </w:t>
+        <w:t xml:space="preserve"> serán abonados por </w:t>
+      </w:r>
+      <w:r>
+        <w:rPr>
+          <w:rFonts w:ascii="Times New Roman" w:hAnsi="Times New Roman" w:cs="Times New Roman"/>
+          <w:sz w:val="24"/>
+          <w:szCs w:val="24"/>
+          <w:lang w:val="es-ES_tradnl"/>
+        </w:rPr>
+        <w:t xml:space="preserve">la </w:t>
+      </w:r>
+      <w:r>
+        <w:rPr>
+          <w:rFonts w:ascii="Times New Roman" w:hAnsi="Times New Roman" w:cs="Times New Roman"/>
+          <w:b/>
+          <w:bCs/>
+          <w:sz w:val="24"/>
+          <w:szCs w:val="24"/>
+          <w:lang w:val="es-ES_tradnl"/>
+        </w:rPr>
+        <w:t>PARTE COMPRADORA</w:t>
+      </w:r>
+      <w:r>
+        <w:rPr>
+          <w:rFonts w:ascii="Times New Roman" w:hAnsi="Times New Roman" w:cs="Times New Roman"/>
+          <w:color w:val="000000"/>
+          <w:sz w:val="24"/>
+          <w:szCs w:val="24"/>
+          <w:lang w:val="es-ES_tradnl"/>
+        </w:rPr>
+        <w:t xml:space="preserve"> </w:t>
+      </w:r>
+      <w:r>
+        <w:rPr>
+          <w:rFonts w:ascii="Times New Roman" w:hAnsi="Times New Roman" w:cs="Times New Roman"/>
+          <w:color w:val="000000"/>
+          <w:sz w:val="24"/>
+          <w:szCs w:val="24"/>
+          <w:lang w:val="es-ES_tradnl"/>
+        </w:rPr>
+        <w:t xml:space="preserve">a la </w:t>
+      </w:r>
+      <w:r>
+        <w:rPr>
+          <w:rFonts w:ascii="Times New Roman" w:hAnsi="Times New Roman" w:cs="Times New Roman"/>
+          <w:b/>
+          <w:bCs/>
+          <w:color w:val="000000"/>
+          <w:sz w:val="24"/>
+          <w:szCs w:val="24"/>
+          <w:lang w:val="es-ES_tradnl"/>
+        </w:rPr>
+        <w:t>PARTE VENDEDORA</w:t>
+      </w:r>
+      <w:r>
+        <w:rPr>
+          <w:rFonts w:ascii="Times New Roman" w:hAnsi="Times New Roman" w:cs="Times New Roman"/>
+          <w:color w:val="000000"/>
+          <w:sz w:val="24"/>
+          <w:szCs w:val="24"/>
+          <w:lang w:val="es-ES_tradnl"/>
+        </w:rPr>
+        <w:t xml:space="preserve"> </w:t>
+      </w:r>
+      <w:r>
+        <w:rPr>
+          <w:rFonts w:ascii="Times New Roman" w:hAnsi="Times New Roman" w:cs="Times New Roman"/>
+          <w:color w:val="000000"/>
+          <w:sz w:val="24"/>
+          <w:szCs w:val="24"/>
+          <w:lang w:val="es-ES_tradnl"/>
+        </w:rPr>
+        <w:t xml:space="preserve">en billetes de dicha moneda, en oportunidad de suscribirse la escritura traslativa de dominio, en el lugar a designar por </w:t>
+      </w:r>
+      <w:r>
+        <w:rPr>
+          <w:rFonts w:ascii="Times New Roman" w:hAnsi="Times New Roman" w:cs="Times New Roman"/>
+          <w:sz w:val="24"/>
+          <w:szCs w:val="24"/>
+          <w:lang w:val="es-ES_tradnl"/>
+        </w:rPr>
+        <w:t xml:space="preserve">la </w:t>
+      </w:r>
+      <w:r>
+        <w:rPr>
+          <w:rFonts w:ascii="Times New Roman" w:hAnsi="Times New Roman" w:cs="Times New Roman"/>
+          <w:b/>
+          <w:bCs/>
+          <w:sz w:val="24"/>
+          <w:szCs w:val="24"/>
+          <w:lang w:val="es-ES_tradnl"/>
+        </w:rPr>
+        <w:t>PARTE COMPRADORA</w:t>
+      </w:r>
+      <w:r>
+        <w:rPr>
+          <w:rFonts w:ascii="Times New Roman" w:hAnsi="Times New Roman" w:cs="Times New Roman"/>
+          <w:color w:val="000000"/>
+          <w:sz w:val="24"/>
+          <w:szCs w:val="24"/>
+          <w:lang w:val="es-ES_tradnl"/>
+        </w:rPr>
+        <w:t xml:space="preserve"> </w:t>
+      </w:r>
+      <w:r>
+        <w:rPr>
+          <w:rFonts w:ascii="Times New Roman" w:hAnsi="Times New Roman" w:cs="Times New Roman"/>
+          <w:color w:val="000000"/>
+          <w:sz w:val="24"/>
+          <w:szCs w:val="24"/>
+          <w:lang w:val="es-ES_tradnl"/>
+        </w:rPr>
+        <w:t xml:space="preserve">dentro del radio de la Ciudad Autónoma de Buenos Aires.- Ambas partes manifiestan que otorgan plena validez al pago que se efectúan mediante el presente y expresan que no tienen reclamo que formularse y renuncian a invocar las acciones establecidas en los artículos 1083 a 1088 del Código Civil y Comercial de la Nación respecto al pacto comisorio, como así también renuncian a cualquier acción que les pudiera corresponder por incumplimiento de la ley 25.345. Las partes renuncian a la facultad de arrepentimiento prevista por el artículo 1059 del mencionado Código.- </w:t>
       </w:r>
     </w:p>
     <w:p>
@@ -2313,7 +2260,7 @@
           <w:szCs w:val="24"/>
           <w:lang w:val="es-ES_tradnl"/>
         </w:rPr>
-        <w:t xml:space="preserve">{#entregaAlSaldo}en oportunidad de suscribirse la escritura traslativa de dominio{/entregaAlSaldo}{#entregaMes}en el mes de {mesEntregaTexto}{/entregaMes}, libre de efectos y/u ocupantes y sin oposición de terceros; recibiéndola ésta última de conformidad.- </w:t>
+        <w:t xml:space="preserve">en oportunidad de suscribirse la escritura traslativa de dominio, libre de efectos y/u ocupantes y sin oposición de terceros; recibiéndola ésta última de conformidad.- </w:t>
       </w:r>
     </w:p>
     <w:p>

</xml_diff>

<commit_message>
feat: update boleto route and template for apoderado, entregaCuota, and OCR fields
Co-Authored-By: Claude Sonnet 4.6 <noreply@anthropic.com>
</commit_message>
<xml_diff>
--- a/src/templates/boleto-template.docx
+++ b/src/templates/boleto-template.docx
@@ -593,37 +593,37 @@
           <w:szCs w:val="24"/>
           <w:lang w:val="es-ES_tradnl"/>
         </w:rPr>
-        <w:t xml:space="preserve">, con frente a la calle </w:t>
-      </w:r>
-      <w:r>
-        <w:rPr>
-          <w:rFonts w:ascii="Times New Roman" w:hAnsi="Times New Roman" w:cs="Times New Roman"/>
-          <w:color w:val="000000"/>
-          <w:sz w:val="24"/>
-          <w:szCs w:val="24"/>
-          <w:lang w:val="es-ES_tradnl"/>
-        </w:rPr>
-        <w:t>{calleInmueble}</w:t>
-      </w:r>
-      <w:r>
-        <w:rPr>
-          <w:rFonts w:ascii="Times New Roman" w:hAnsi="Times New Roman" w:cs="Times New Roman"/>
-          <w:color w:val="000000"/>
-          <w:sz w:val="24"/>
-          <w:szCs w:val="24"/>
-          <w:lang w:val="es-ES_tradnl"/>
-        </w:rPr>
-        <w:t xml:space="preserve">, entre las de </w:t>
-      </w:r>
-      <w:r>
-        <w:rPr>
-          <w:rFonts w:ascii="Times New Roman" w:hAnsi="Times New Roman" w:cs="Times New Roman"/>
-          <w:color w:val="000000"/>
-          <w:sz w:val="24"/>
-          <w:szCs w:val="24"/>
-          <w:lang w:val="es-ES_tradnl"/>
-        </w:rPr>
-        <w:t>{limites}</w:t>
+        <w:t xml:space="preserve">{#calleInmueble}, con frente a la calle {calleInmueble}{/calleInmueble}</w:t>
+      </w:r>
+      <w:r>
+        <w:rPr>
+          <w:rFonts w:ascii="Times New Roman" w:hAnsi="Times New Roman" w:cs="Times New Roman"/>
+          <w:color w:val="000000"/>
+          <w:sz w:val="24"/>
+          <w:szCs w:val="24"/>
+          <w:lang w:val="es-ES_tradnl"/>
+        </w:rPr>
+        <w:t/>
+      </w:r>
+      <w:r>
+        <w:rPr>
+          <w:rFonts w:ascii="Times New Roman" w:hAnsi="Times New Roman" w:cs="Times New Roman"/>
+          <w:color w:val="000000"/>
+          <w:sz w:val="24"/>
+          <w:szCs w:val="24"/>
+          <w:lang w:val="es-ES_tradnl"/>
+        </w:rPr>
+        <w:t xml:space="preserve">{#limites}, entre las de {limites}{/limites}</w:t>
+      </w:r>
+      <w:r>
+        <w:rPr>
+          <w:rFonts w:ascii="Times New Roman" w:hAnsi="Times New Roman" w:cs="Times New Roman"/>
+          <w:color w:val="000000"/>
+          <w:sz w:val="24"/>
+          <w:szCs w:val="24"/>
+          <w:lang w:val="es-ES_tradnl"/>
+        </w:rPr>
+        <w:t/>
       </w:r>
       <w:r>
         <w:rPr>
@@ -1775,119 +1775,27 @@
           <w:szCs w:val="24"/>
           <w:lang w:val="es-ES_tradnl"/>
         </w:rPr>
-        <w:t xml:space="preserve"> serán abonados por </w:t>
-      </w:r>
-      <w:r>
-        <w:rPr>
-          <w:rFonts w:ascii="Times New Roman" w:hAnsi="Times New Roman" w:cs="Times New Roman"/>
-          <w:sz w:val="24"/>
-          <w:szCs w:val="24"/>
-          <w:lang w:val="es-ES_tradnl"/>
-        </w:rPr>
-        <w:t xml:space="preserve">la </w:t>
-      </w:r>
-      <w:r>
-        <w:rPr>
-          <w:rFonts w:ascii="Times New Roman" w:hAnsi="Times New Roman" w:cs="Times New Roman"/>
-          <w:b/>
-          <w:bCs/>
-          <w:sz w:val="24"/>
-          <w:szCs w:val="24"/>
-          <w:lang w:val="es-ES_tradnl"/>
-        </w:rPr>
-        <w:t>PARTE COMPRADORA</w:t>
-      </w:r>
-      <w:r>
-        <w:rPr>
-          <w:rFonts w:ascii="Times New Roman" w:hAnsi="Times New Roman" w:cs="Times New Roman"/>
-          <w:color w:val="000000"/>
-          <w:sz w:val="24"/>
-          <w:szCs w:val="24"/>
-          <w:lang w:val="es-ES_tradnl"/>
-        </w:rPr>
-        <w:t xml:space="preserve"> </w:t>
-      </w:r>
-      <w:r>
-        <w:rPr>
-          <w:rFonts w:ascii="Times New Roman" w:hAnsi="Times New Roman" w:cs="Times New Roman"/>
-          <w:color w:val="000000"/>
-          <w:sz w:val="24"/>
-          <w:szCs w:val="24"/>
-          <w:lang w:val="es-ES_tradnl"/>
-        </w:rPr>
-        <w:t xml:space="preserve">a la </w:t>
-      </w:r>
-      <w:r>
-        <w:rPr>
-          <w:rFonts w:ascii="Times New Roman" w:hAnsi="Times New Roman" w:cs="Times New Roman"/>
-          <w:b/>
-          <w:bCs/>
-          <w:color w:val="000000"/>
-          <w:sz w:val="24"/>
-          <w:szCs w:val="24"/>
-          <w:lang w:val="es-ES_tradnl"/>
-        </w:rPr>
-        <w:t>PARTE VENDEDORA</w:t>
-      </w:r>
-      <w:r>
-        <w:rPr>
-          <w:rFonts w:ascii="Times New Roman" w:hAnsi="Times New Roman" w:cs="Times New Roman"/>
-          <w:color w:val="000000"/>
-          <w:sz w:val="24"/>
-          <w:szCs w:val="24"/>
-          <w:lang w:val="es-ES_tradnl"/>
-        </w:rPr>
-        <w:t xml:space="preserve"> </w:t>
-      </w:r>
-      <w:r>
-        <w:rPr>
-          <w:rFonts w:ascii="Times New Roman" w:hAnsi="Times New Roman" w:cs="Times New Roman"/>
-          <w:color w:val="000000"/>
-          <w:sz w:val="24"/>
-          <w:szCs w:val="24"/>
-          <w:lang w:val="es-ES_tradnl"/>
-        </w:rPr>
-        <w:t xml:space="preserve">en billetes de dicha moneda, en oportunidad de suscribirse la escritura traslativa de dominio, en el lugar a designar por </w:t>
-      </w:r>
-      <w:r>
-        <w:rPr>
-          <w:rFonts w:ascii="Times New Roman" w:hAnsi="Times New Roman" w:cs="Times New Roman"/>
-          <w:sz w:val="24"/>
-          <w:szCs w:val="24"/>
-          <w:lang w:val="es-ES_tradnl"/>
-        </w:rPr>
-        <w:t xml:space="preserve">la </w:t>
-      </w:r>
-      <w:r>
-        <w:rPr>
-          <w:rFonts w:ascii="Times New Roman" w:hAnsi="Times New Roman" w:cs="Times New Roman"/>
-          <w:b/>
-          <w:bCs/>
-          <w:sz w:val="24"/>
-          <w:szCs w:val="24"/>
-          <w:lang w:val="es-ES_tradnl"/>
-        </w:rPr>
-        <w:t>PARTE COMPRADORA</w:t>
-      </w:r>
-      <w:r>
-        <w:rPr>
-          <w:rFonts w:ascii="Times New Roman" w:hAnsi="Times New Roman" w:cs="Times New Roman"/>
-          <w:color w:val="000000"/>
-          <w:sz w:val="24"/>
-          <w:szCs w:val="24"/>
-          <w:lang w:val="es-ES_tradnl"/>
-        </w:rPr>
-        <w:t xml:space="preserve"> </w:t>
-      </w:r>
-      <w:r>
-        <w:rPr>
-          <w:rFonts w:ascii="Times New Roman" w:hAnsi="Times New Roman" w:cs="Times New Roman"/>
-          <w:color w:val="000000"/>
-          <w:sz w:val="24"/>
-          <w:szCs w:val="24"/>
-          <w:lang w:val="es-ES_tradnl"/>
-        </w:rPr>
-        <w:t xml:space="preserve">dentro del radio de la Ciudad Autónoma de Buenos Aires.- Ambas partes manifiestan que otorgan plena validez al pago que se efectúan mediante el presente y expresan que no tienen reclamo que formularse y renuncian a invocar las acciones establecidas en los artículos 1083 a 1088 del Código Civil y Comercial de la Nación respecto al pacto comisorio, como así también renuncian a cualquier acción que les pudiera corresponder por incumplimiento de la ley 25.345. Las partes renuncian a la facultad de arrepentimiento prevista por el artículo 1059 del mencionado Código.- </w:t>
+        <w:t xml:space="preserve"/>
+      </w:r>
+      <w:r>
+        <w:rPr>
+          <w:rFonts w:ascii="Times New Roman" w:hAnsi="Times New Roman" w:cs="Times New Roman"/>
+          <w:color w:val="000000"/>
+          <w:sz w:val="24"/>
+          <w:szCs w:val="24"/>
+          <w:lang w:val="es-ES_tradnl"/>
+        </w:rPr>
+        <w:t xml:space="preserve"> serán abonados por la PARTE COMPRADORA a la PARTE VENDEDORA en billetes de dicha moneda, {#sinCuotas}en oportunidad de suscribirse la escritura traslativa de dominio, en el lugar a designar por la PARTE COMPRADORA dentro del radio de la Ciudad Autónoma de Buenos Aires.-{/sinCuotas}{#tieneCuotas}en {cantidadCuotas} cuotas mensuales, iguales y consecutivas de DÓLARES ESTADOUNIDENSES BILLETE {cuotaMensualPalabras} (U$S {cuotaMensual}) cada una, a partir de la fecha de suscripción del presente.-{/tieneCuotas}</w:t>
+      </w:r>
+      <w:r>
+        <w:rPr>
+          <w:rFonts w:ascii="Times New Roman" w:hAnsi="Times New Roman" w:cs="Times New Roman"/>
+          <w:color w:val="000000"/>
+          <w:sz w:val="24"/>
+          <w:szCs w:val="24"/>
+          <w:lang w:val="es-ES_tradnl"/>
+        </w:rPr>
+        <w:t> Ambas partes manifiestan que otorgan plena validez al pago que se efectúan mediante el presente y expresan que no tienen reclamo que formularse y renuncian a invocar las acciones establecidas en los artículos 1083 a 1088 del Código Civil y Comercial de la Nación respecto al pacto comisorio, como así también renuncian a cualquier acción que les pudiera corresponder por incumplimiento de la ley 25.345. Las partes renuncian a la facultad de arrepentimiento prevista por el artículo 1059 del mencionado Código.- </w:t>
       </w:r>
     </w:p>
     <w:p>
@@ -2260,7 +2168,7 @@
           <w:szCs w:val="24"/>
           <w:lang w:val="es-ES_tradnl"/>
         </w:rPr>
-        <w:t xml:space="preserve">en oportunidad de suscribirse la escritura traslativa de dominio, libre de efectos y/u ocupantes y sin oposición de terceros; recibiéndola ésta última de conformidad.- </w:t>
+        <w:t xml:space="preserve">{#entregaAlSaldo}en oportunidad de suscribirse la escritura traslativa de dominio{/entregaAlSaldo}{#entregaCuota}contra el pago de la cuota N° {numeroCuotaEntrega}{/entregaCuota}, libre de efectos y/u ocupantes y sin oposición de terceros; recibiéndola ésta última de conformidad.- </w:t>
       </w:r>
     </w:p>
     <w:p>

</xml_diff>

<commit_message>
feat: redesign boleto payment flow with contado/financiado toggle
- Add explicit tipoPago ("contado" | "financiado") field to boleto route schema
- Replace cantidadCuotas-based tieneCuotas/sinCuotas logic with tipoPago flag
- Update boleto-dialog.tsx: add payment type selector, show cuotas fields only when financiado, sync tipoPago from parcela.formaPago and OCR results
- Update lotes/[id]/page.tsx: replace free-text formaPago input with Select (contado/financiado), show cuotas fields conditionally
- Update ocr-boleto prompt to detect and return tipoPago field
- Fix boleto-template.docx SEXTA clause: change "desde la fecha de suscripción de la presente" to "desde la fecha del pago del saldo total"
- Fix boleto-template.docx TERCERA clause: replace sinCuotas escritura text with "en un único pago.-"
- Delete build-boleto-template.js (one-time script, no longer needed)

Co-Authored-By: Claude Sonnet 4.6 <noreply@anthropic.com>
</commit_message>
<xml_diff>
--- a/src/templates/boleto-template.docx
+++ b/src/templates/boleto-template.docx
@@ -1785,7 +1785,7 @@
           <w:szCs w:val="24"/>
           <w:lang w:val="es-ES_tradnl"/>
         </w:rPr>
-        <w:t xml:space="preserve"> serán abonados por la PARTE COMPRADORA a la PARTE VENDEDORA en billetes de dicha moneda, {#sinCuotas}en oportunidad de suscribirse la escritura traslativa de dominio, en el lugar a designar por la PARTE COMPRADORA dentro del radio de la Ciudad Autónoma de Buenos Aires.-{/sinCuotas}{#tieneCuotas}en {cantidadCuotas} cuotas mensuales, iguales y consecutivas de DÓLARES ESTADOUNIDENSES BILLETE {cuotaMensualPalabras} (U$S {cuotaMensual}) cada una, a partir de la fecha de suscripción del presente.-{/tieneCuotas}</w:t>
+        <w:t xml:space="preserve"> serán abonados por la PARTE COMPRADORA a la PARTE VENDEDORA en billetes de dicha moneda, {#sinCuotas}en un único pago.-{/sinCuotas}{#tieneCuotas}en {cantidadCuotas} cuotas mensuales, iguales y consecutivas de DÓLARES ESTADOUNIDENSES BILLETE {cuotaMensualPalabras} (U$S {cuotaMensual}) cada una, a partir de la fecha de suscripción del presente.-{/tieneCuotas}</w:t>
       </w:r>
       <w:r>
         <w:rPr>
@@ -2309,7 +2309,7 @@
           <w:szCs w:val="24"/>
           <w:lang w:val="es-ES_tradnl"/>
         </w:rPr>
-        <w:t xml:space="preserve"> días contados desde la fecha de suscripción de la presente</w:t>
+        <w:t xml:space="preserve"> días contados desde la fecha del pago del saldo total</w:t>
       </w:r>
       <w:r>
         <w:rPr>

</xml_diff>

<commit_message>
feat: add fecha de firma to reserva form and boleto dialog
- Add fechaFirma column to parcelas schema (migration 0006)
- Add fechaFirma to parcela API route (COMERCIAL_FIELDS + updateSchema)
- Add Fecha de firma date input to reservation form (lotes/[id]/page.tsx)
- Add Fecha de firma date input to boleto dialog; auto-syncs to dia/mes/anio fields used by template
- Update boleto-template.docx to use {dia}/{mes}/{anio} placeholders instead of hardcoded date

Co-Authored-By: Claude Sonnet 4.6 <noreply@anthropic.com>
</commit_message>
<xml_diff>
--- a/src/templates/boleto-template.docx
+++ b/src/templates/boleto-template.docx
@@ -1,6 +1,6 @@
 
 <file path=word/document.xml><?xml version="1.0" encoding="utf-8"?>
-<w:document xmlns:wpc="http://schemas.microsoft.com/office/word/2010/wordprocessingCanvas" xmlns:cx="http://schemas.microsoft.com/office/drawing/2014/chartex" xmlns:cx1="http://schemas.microsoft.com/office/drawing/2015/9/8/chartex" xmlns:cx2="http://schemas.microsoft.com/office/drawing/2015/10/21/chartex" xmlns:cx3="http://schemas.microsoft.com/office/drawing/2016/5/9/chartex" xmlns:cx4="http://schemas.microsoft.com/office/drawing/2016/5/10/chartex" xmlns:cx5="http://schemas.microsoft.com/office/drawing/2016/5/11/chartex" xmlns:cx6="http://schemas.microsoft.com/office/drawing/2016/5/12/chartex" xmlns:cx7="http://schemas.microsoft.com/office/drawing/2016/5/13/chartex" xmlns:cx8="http://schemas.microsoft.com/office/drawing/2016/5/14/chartex" xmlns:mc="http://schemas.openxmlformats.org/markup-compatibility/2006" xmlns:aink="http://schemas.microsoft.com/office/drawing/2016/ink" xmlns:am3d="http://schemas.microsoft.com/office/drawing/2017/model3d" xmlns:o="urn:schemas-microsoft-com:office:office" xmlns:r="http://schemas.openxmlformats.org/officeDocument/2006/relationships" xmlns:m="http://schemas.openxmlformats.org/officeDocument/2006/math" xmlns:v="urn:schemas-microsoft-com:vml" xmlns:wp14="http://schemas.microsoft.com/office/word/2010/wordprocessingDrawing" xmlns:wp="http://schemas.openxmlformats.org/drawingml/2006/wordprocessingDrawing" xmlns:w10="urn:schemas-microsoft-com:office:word" xmlns:w="http://schemas.openxmlformats.org/wordprocessingml/2006/main" xmlns:w14="http://schemas.microsoft.com/office/word/2010/wordml" xmlns:w15="http://schemas.microsoft.com/office/word/2012/wordml" xmlns:w16cex="http://schemas.microsoft.com/office/word/2018/wordml/cex" xmlns:w16cid="http://schemas.microsoft.com/office/word/2016/wordml/cid" xmlns:w16="http://schemas.microsoft.com/office/word/2018/wordml" xmlns:w16se="http://schemas.microsoft.com/office/word/2015/wordml/symex" xmlns:wpg="http://schemas.microsoft.com/office/word/2010/wordprocessingGroup" xmlns:wpi="http://schemas.microsoft.com/office/word/2010/wordprocessingInk" xmlns:wne="http://schemas.microsoft.com/office/word/2006/wordml" xmlns:wps="http://schemas.microsoft.com/office/word/2010/wordprocessingShape" mc:Ignorable="w14 w15 w16se w16cid w16 w16cex wp14">
+<w:document xmlns:wpc="http://schemas.microsoft.com/office/word/2010/wordprocessingCanvas" xmlns:cx="http://schemas.microsoft.com/office/drawing/2014/chartex" xmlns:cx1="http://schemas.microsoft.com/office/drawing/2015/9/8/chartex" xmlns:cx2="http://schemas.microsoft.com/office/drawing/2015/10/21/chartex" xmlns:cx3="http://schemas.microsoft.com/office/drawing/2016/5/9/chartex" xmlns:cx4="http://schemas.microsoft.com/office/drawing/2016/5/10/chartex" xmlns:cx5="http://schemas.microsoft.com/office/drawing/2016/5/11/chartex" xmlns:cx6="http://schemas.microsoft.com/office/drawing/2016/5/12/chartex" xmlns:cx7="http://schemas.microsoft.com/office/drawing/2016/5/13/chartex" xmlns:cx8="http://schemas.microsoft.com/office/drawing/2016/5/14/chartex" xmlns:mc="http://schemas.openxmlformats.org/markup-compatibility/2006" xmlns:aink="http://schemas.microsoft.com/office/drawing/2016/ink" xmlns:am3d="http://schemas.microsoft.com/office/drawing/2017/model3d" xmlns:o="urn:schemas-microsoft-com:office:office" xmlns:oel="http://schemas.microsoft.com/office/2019/extlst" xmlns:r="http://schemas.openxmlformats.org/officeDocument/2006/relationships" xmlns:m="http://schemas.openxmlformats.org/officeDocument/2006/math" xmlns:v="urn:schemas-microsoft-com:vml" xmlns:wp14="http://schemas.microsoft.com/office/word/2010/wordprocessingDrawing" xmlns:wp="http://schemas.openxmlformats.org/drawingml/2006/wordprocessingDrawing" xmlns:w10="urn:schemas-microsoft-com:office:word" xmlns:w="http://schemas.openxmlformats.org/wordprocessingml/2006/main" xmlns:w14="http://schemas.microsoft.com/office/word/2010/wordml" xmlns:w15="http://schemas.microsoft.com/office/word/2012/wordml" xmlns:w16cex="http://schemas.microsoft.com/office/word/2018/wordml/cex" xmlns:w16cid="http://schemas.microsoft.com/office/word/2016/wordml/cid" xmlns:w16="http://schemas.microsoft.com/office/word/2018/wordml" xmlns:w16du="http://schemas.microsoft.com/office/word/2023/wordml/word16du" xmlns:w16sdtdh="http://schemas.microsoft.com/office/word/2020/wordml/sdtdatahash" xmlns:w16sdtfl="http://schemas.microsoft.com/office/word/2024/wordml/sdtformatlock" xmlns:w16se="http://schemas.microsoft.com/office/word/2015/wordml/symex" xmlns:wpg="http://schemas.microsoft.com/office/word/2010/wordprocessingGroup" xmlns:wpi="http://schemas.microsoft.com/office/word/2010/wordprocessingInk" xmlns:wne="http://schemas.microsoft.com/office/word/2006/wordml" xmlns:wps="http://schemas.microsoft.com/office/word/2010/wordprocessingShape" mc:Ignorable="w14 w15 w16se w16cid w16 w16cex w16sdtdh w16sdtfl w16du wp14">
   <w:body>
     <w:p>
       <w:pPr>
@@ -27,17 +27,113 @@
           <w:szCs w:val="24"/>
           <w:lang w:val="es-ES_tradnl"/>
         </w:rPr>
-        <w:t xml:space="preserve">{^hasApoderado}1) MIGUEL ÁNGEL LÁZZARO, argentino, titular del Documento Nacional de Identidad 8.206.039 y del CUIL 20-08206039-2, domiciliado en la calle Ladislao Martínez 243 Piso 2, Localidad de Martínez, Partido de San Isidro, Provincia de Buenos Aires, quien interviene en nombre y representación, en su carácter de Presidente de la Sociedad que gira en esta plaza, bajo la denominación de “BARRIO STEFANI SOCIEDAD ANÓNIMA”, CUIT 30-71917882-7, con sede social en la calle Talcahuano 469, Piso 2, de ésta Ciudad{/hasApoderado}{#hasApoderado}1) “BARRIO STEFANI SOCIEDAD ANÓNIMA”, CUIT 30-71917882-7, con sede social en la calle Talcahuano 469, Piso 2, de ésta Ciudad, representada en este acto por {nombreApoderado}, titular del Documento Nacional de Identidad {dniApoderado}{/hasApoderado}</w:t>
-      </w:r>
-      <w:r>
-        <w:rPr>
-          <w:rFonts w:ascii="Times New Roman" w:hAnsi="Times New Roman" w:cs="Times New Roman"/>
-          <w:color w:val="000000"/>
-          <w:sz w:val="24"/>
-          <w:szCs w:val="24"/>
-          <w:lang w:val="es-ES_tradnl"/>
-        </w:rPr>
-        <w:t xml:space="preserve">, </w:t>
+        <w:t>En la ciudad de Buenos Aires</w:t>
+      </w:r>
+      <w:r>
+        <w:rPr>
+          <w:rFonts w:ascii="Times New Roman" w:hAnsi="Times New Roman" w:cs="Times New Roman"/>
+          <w:color w:val="000000"/>
+          <w:sz w:val="24"/>
+          <w:szCs w:val="24"/>
+          <w:lang w:val="es-ES_tradnl"/>
+        </w:rPr>
+        <w:t xml:space="preserve"> </w:t>
+      </w:r>
+      <w:r>
+        <w:rPr>
+          <w:rFonts w:ascii="Times New Roman" w:hAnsi="Times New Roman" w:cs="Times New Roman"/>
+          <w:color w:val="000000"/>
+          <w:sz w:val="24"/>
+          <w:szCs w:val="24"/>
+          <w:lang w:val="es-ES_tradnl"/>
+        </w:rPr>
+        <w:t>a los {</w:t>
+      </w:r>
+      <w:proofErr w:type="spellStart"/>
+      <w:r>
+        <w:rPr>
+          <w:rFonts w:ascii="Times New Roman" w:hAnsi="Times New Roman" w:cs="Times New Roman"/>
+          <w:color w:val="000000"/>
+          <w:sz w:val="24"/>
+          <w:szCs w:val="24"/>
+          <w:lang w:val="es-ES_tradnl"/>
+        </w:rPr>
+        <w:t>dia</w:t>
+      </w:r>
+      <w:proofErr w:type="spellEnd"/>
+      <w:r>
+        <w:rPr>
+          <w:rFonts w:ascii="Times New Roman" w:hAnsi="Times New Roman" w:cs="Times New Roman"/>
+          <w:color w:val="000000"/>
+          <w:sz w:val="24"/>
+          <w:szCs w:val="24"/>
+          <w:lang w:val="es-ES_tradnl"/>
+        </w:rPr>
+        <w:t>} días del mes de {mes} del año {</w:t>
+      </w:r>
+      <w:proofErr w:type="spellStart"/>
+      <w:r>
+        <w:rPr>
+          <w:rFonts w:ascii="Times New Roman" w:hAnsi="Times New Roman" w:cs="Times New Roman"/>
+          <w:color w:val="000000"/>
+          <w:sz w:val="24"/>
+          <w:szCs w:val="24"/>
+          <w:lang w:val="es-ES_tradnl"/>
+        </w:rPr>
+        <w:t>anio</w:t>
+      </w:r>
+      <w:proofErr w:type="spellEnd"/>
+      <w:r>
+        <w:rPr>
+          <w:rFonts w:ascii="Times New Roman" w:hAnsi="Times New Roman" w:cs="Times New Roman"/>
+          <w:color w:val="000000"/>
+          <w:sz w:val="24"/>
+          <w:szCs w:val="24"/>
+          <w:lang w:val="es-ES_tradnl"/>
+        </w:rPr>
+        <w:t>}</w:t>
+      </w:r>
+      <w:r>
+        <w:rPr>
+          <w:rFonts w:ascii="Times New Roman" w:hAnsi="Times New Roman" w:cs="Times New Roman"/>
+          <w:color w:val="000000"/>
+          <w:sz w:val="24"/>
+          <w:szCs w:val="24"/>
+          <w:lang w:val="es-ES_tradnl"/>
+        </w:rPr>
+        <w:t xml:space="preserve">, comparece por una parte </w:t>
+      </w:r>
+      <w:r>
+        <w:rPr>
+          <w:rFonts w:ascii="Times New Roman" w:hAnsi="Times New Roman" w:cs="Times New Roman"/>
+          <w:color w:val="000000"/>
+          <w:sz w:val="24"/>
+          <w:szCs w:val="24"/>
+          <w:lang w:val="es-ES_tradnl"/>
+        </w:rPr>
+        <w:t>{^</w:t>
+      </w:r>
+      <w:proofErr w:type="spellStart"/>
+      <w:r>
+        <w:rPr>
+          <w:rFonts w:ascii="Times New Roman" w:hAnsi="Times New Roman" w:cs="Times New Roman"/>
+          <w:color w:val="000000"/>
+          <w:sz w:val="24"/>
+          <w:szCs w:val="24"/>
+          <w:lang w:val="es-ES_tradnl"/>
+        </w:rPr>
+        <w:t>hasApoderado</w:t>
+      </w:r>
+      <w:proofErr w:type="spellEnd"/>
+      <w:r>
+        <w:rPr>
+          <w:rFonts w:ascii="Times New Roman" w:hAnsi="Times New Roman" w:cs="Times New Roman"/>
+          <w:color w:val="000000"/>
+          <w:sz w:val="24"/>
+          <w:szCs w:val="24"/>
+          <w:lang w:val="es-ES_tradnl"/>
+        </w:rPr>
+        <w:t xml:space="preserve">}1) MIGUEL ÁNGEL LÁZZARO, argentino, titular del Documento Nacional de Identidad 8.206.039 y del CUIL 20-08206039-2, domiciliado en la calle Ladislao Martínez 243 Piso 2, Localidad de Martínez, Partido de San Isidro, Provincia de Buenos Aires, quien interviene en nombre y representación, en su carácter de Presidente de la Sociedad que gira en esta plaza, bajo la denominación de “BARRIO STEFANI SOCIEDAD ANÓNIMA”, CUIT 30-71917882-7, con sede social en la calle Talcahuano 469, Piso 2, de ésta Ciudad{/hasApoderado}{#hasApoderado}1) “BARRIO STEFANI SOCIEDAD ANÓNIMA”, CUIT 30-71917882-7, con sede social en la calle Talcahuano 469, Piso 2, de ésta Ciudad, representada en este acto por {nombreApoderado}, titular del Documento Nacional de Identidad {dniApoderado}{/hasApoderado}, </w:t>
       </w:r>
       <w:r>
         <w:rPr>
@@ -150,16 +246,6 @@
           <w:szCs w:val="24"/>
           <w:lang w:val="es-ES_tradnl"/>
         </w:rPr>
-        <w:t/>
-      </w:r>
-      <w:r>
-        <w:rPr>
-          <w:rFonts w:ascii="Times New Roman" w:hAnsi="Times New Roman" w:cs="Times New Roman"/>
-          <w:color w:val="000000"/>
-          <w:sz w:val="24"/>
-          <w:szCs w:val="24"/>
-          <w:lang w:val="es-ES_tradnl"/>
-        </w:rPr>
         <w:t>{nacionalidad}</w:t>
       </w:r>
       <w:r>
@@ -180,127 +266,7 @@
           <w:szCs w:val="24"/>
           <w:lang w:val="es-ES_tradnl"/>
         </w:rPr>
-        <w:t>{fechaNacimiento}</w:t>
-      </w:r>
-      <w:r>
-        <w:rPr>
-          <w:rFonts w:ascii="Times New Roman" w:hAnsi="Times New Roman" w:cs="Times New Roman"/>
-          <w:color w:val="000000"/>
-          <w:sz w:val="24"/>
-          <w:szCs w:val="24"/>
-          <w:lang w:val="es-ES_tradnl"/>
-        </w:rPr>
-        <w:t/>
-      </w:r>
-      <w:r>
-        <w:rPr>
-          <w:rFonts w:ascii="Times New Roman" w:hAnsi="Times New Roman" w:cs="Times New Roman"/>
-          <w:color w:val="000000"/>
-          <w:sz w:val="24"/>
-          <w:szCs w:val="24"/>
-          <w:lang w:val="es-ES_tradnl"/>
-        </w:rPr>
-        <w:t xml:space="preserve">, </w:t>
-      </w:r>
-      <w:r>
-        <w:rPr>
-          <w:rFonts w:ascii="Times New Roman" w:hAnsi="Times New Roman" w:cs="Times New Roman"/>
-          <w:color w:val="000000"/>
-          <w:sz w:val="24"/>
-          <w:szCs w:val="24"/>
-          <w:lang w:val="es-ES_tradnl"/>
-        </w:rPr>
-        <w:t/>
-      </w:r>
-      <w:r>
-        <w:rPr>
-          <w:rFonts w:ascii="Times New Roman" w:hAnsi="Times New Roman" w:cs="Times New Roman"/>
-          <w:color w:val="000000"/>
-          <w:sz w:val="24"/>
-          <w:szCs w:val="24"/>
-          <w:lang w:val="es-ES_tradnl"/>
-        </w:rPr>
-        <w:t>{estadoCivil}</w:t>
-      </w:r>
-      <w:r>
-        <w:rPr>
-          <w:rFonts w:ascii="Times New Roman" w:hAnsi="Times New Roman" w:cs="Times New Roman"/>
-          <w:color w:val="000000"/>
-          <w:sz w:val="24"/>
-          <w:szCs w:val="24"/>
-          <w:lang w:val="es-ES_tradnl"/>
-        </w:rPr>
-        <w:t/>
-      </w:r>
-      <w:r>
-        <w:rPr>
-          <w:rFonts w:ascii="Times New Roman" w:hAnsi="Times New Roman" w:cs="Times New Roman"/>
-          <w:color w:val="000000"/>
-          <w:sz w:val="24"/>
-          <w:szCs w:val="24"/>
-          <w:lang w:val="es-ES_tradnl"/>
-        </w:rPr>
-        <w:t xml:space="preserve">, titular del Documento Nacional de Identidad </w:t>
-      </w:r>
-      <w:r>
-        <w:rPr>
-          <w:rFonts w:ascii="Times New Roman" w:hAnsi="Times New Roman" w:cs="Times New Roman"/>
-          <w:color w:val="000000"/>
-          <w:sz w:val="24"/>
-          <w:szCs w:val="24"/>
-          <w:lang w:val="es-ES_tradnl"/>
-        </w:rPr>
-        <w:t>{dniComprador}</w:t>
-      </w:r>
-      <w:r>
-        <w:rPr>
-          <w:rFonts w:ascii="Times New Roman" w:hAnsi="Times New Roman" w:cs="Times New Roman"/>
-          <w:color w:val="000000"/>
-          <w:sz w:val="24"/>
-          <w:szCs w:val="24"/>
-          <w:lang w:val="es-ES_tradnl"/>
-        </w:rPr>
-        <w:t xml:space="preserve">, CUIT </w:t>
-      </w:r>
-      <w:r>
-        <w:rPr>
-          <w:rFonts w:ascii="Times New Roman" w:hAnsi="Times New Roman" w:cs="Times New Roman"/>
-          <w:color w:val="000000"/>
-          <w:sz w:val="24"/>
-          <w:szCs w:val="24"/>
-          <w:lang w:val="es-ES_tradnl"/>
-        </w:rPr>
-        <w:t>{cuitComprador}</w:t>
-      </w:r>
-      <w:r>
-        <w:rPr>
-          <w:rFonts w:ascii="Times New Roman" w:hAnsi="Times New Roman" w:cs="Times New Roman"/>
-          <w:color w:val="000000"/>
-          <w:sz w:val="24"/>
-          <w:szCs w:val="24"/>
-          <w:lang w:val="es-ES_tradnl"/>
-        </w:rPr>
-        <w:t xml:space="preserve">, domiciliado en </w:t>
-      </w:r>
-      <w:r>
-        <w:rPr>
-          <w:rFonts w:ascii="Times New Roman" w:hAnsi="Times New Roman" w:cs="Times New Roman"/>
-          <w:color w:val="000000"/>
-          <w:sz w:val="24"/>
-          <w:szCs w:val="24"/>
-          <w:lang w:val="es-ES_tradnl"/>
-        </w:rPr>
-        <w:t>{domicilioComprador}</w:t>
-      </w:r>
-      <w:r>
-        <w:rPr>
-          <w:rFonts w:ascii="Times New Roman" w:hAnsi="Times New Roman" w:cs="Times New Roman"/>
-          <w:color w:val="000000"/>
-          <w:sz w:val="24"/>
-          <w:szCs w:val="24"/>
-          <w:lang w:val="es-ES_tradnl"/>
-        </w:rPr>
-        <w:t xml:space="preserve">{#hasCoComprador}, y {nombreCoComprador}, titular del DNI {dniCoComprador}, CUIT {cuitCoComprador}, {estadoCivilCoComprador}, adquiriendo el {porcentajeCoComprador}% de la compra{/hasCoComprador}, en adelante denominado </w:t>
+        <w:t xml:space="preserve">{fechaNacimiento}, {estadoCivil}, titular del Documento Nacional de Identidad {dniComprador}, CUIT {cuitComprador}, domiciliado en {domicilioComprador}{#hasCoComprador}, y {nombreCoComprador}, titular del DNI {dniCoComprador}, CUIT {cuitCoComprador}, {estadoCivilCoComprador}, adquiriendo el {porcentajeCoComprador}% de la compra{/hasCoComprador}, en adelante denominado </w:t>
       </w:r>
       <w:r>
         <w:rPr>
@@ -593,47 +559,18 @@
           <w:szCs w:val="24"/>
           <w:lang w:val="es-ES_tradnl"/>
         </w:rPr>
-        <w:t xml:space="preserve">{#calleInmueble}, con frente a la calle {calleInmueble}{/calleInmueble}</w:t>
-      </w:r>
-      <w:r>
-        <w:rPr>
-          <w:rFonts w:ascii="Times New Roman" w:hAnsi="Times New Roman" w:cs="Times New Roman"/>
-          <w:color w:val="000000"/>
-          <w:sz w:val="24"/>
-          <w:szCs w:val="24"/>
-          <w:lang w:val="es-ES_tradnl"/>
-        </w:rPr>
-        <w:t/>
-      </w:r>
-      <w:r>
-        <w:rPr>
-          <w:rFonts w:ascii="Times New Roman" w:hAnsi="Times New Roman" w:cs="Times New Roman"/>
-          <w:color w:val="000000"/>
-          <w:sz w:val="24"/>
-          <w:szCs w:val="24"/>
-          <w:lang w:val="es-ES_tradnl"/>
-        </w:rPr>
-        <w:t xml:space="preserve">{#limites}, entre las de {limites}{/limites}</w:t>
-      </w:r>
-      <w:r>
-        <w:rPr>
-          <w:rFonts w:ascii="Times New Roman" w:hAnsi="Times New Roman" w:cs="Times New Roman"/>
-          <w:color w:val="000000"/>
-          <w:sz w:val="24"/>
-          <w:szCs w:val="24"/>
-          <w:lang w:val="es-ES_tradnl"/>
-        </w:rPr>
-        <w:t/>
-      </w:r>
-      <w:r>
-        <w:rPr>
-          <w:rFonts w:ascii="Times New Roman" w:hAnsi="Times New Roman" w:cs="Times New Roman"/>
-          <w:color w:val="000000"/>
-          <w:sz w:val="24"/>
-          <w:szCs w:val="24"/>
-          <w:lang w:val="es-ES_tradnl"/>
-        </w:rPr>
-        <w:t>, edificada en el lote</w:t>
+        <w:t xml:space="preserve">{#calleInmueble}, con frente a la calle </w:t>
+      </w:r>
+      <w:r>
+        <w:rPr>
+          <w:rFonts w:ascii="Times New Roman" w:hAnsi="Times New Roman" w:cs="Times New Roman"/>
+          <w:color w:val="000000"/>
+          <w:sz w:val="24"/>
+          <w:szCs w:val="24"/>
+          <w:lang w:val="es-ES_tradnl"/>
+        </w:rPr>
+        <w:lastRenderedPageBreak/>
+        <w:t>{calleInmueble}{/calleInmueble}{#limites}, entre las de {limites}{/limites}, edificada en el lote</w:t>
       </w:r>
       <w:r>
         <w:rPr>
@@ -653,16 +590,6 @@
           <w:szCs w:val="24"/>
           <w:lang w:val="es-ES_tradnl"/>
         </w:rPr>
-        <w:t/>
-      </w:r>
-      <w:r>
-        <w:rPr>
-          <w:rFonts w:ascii="Times New Roman" w:hAnsi="Times New Roman" w:cs="Times New Roman"/>
-          <w:color w:val="000000"/>
-          <w:sz w:val="24"/>
-          <w:szCs w:val="24"/>
-          <w:lang w:val="es-ES_tradnl"/>
-        </w:rPr>
         <w:t>{tituloPlano}</w:t>
       </w:r>
       <w:r>
@@ -673,16 +600,6 @@
           <w:szCs w:val="24"/>
           <w:lang w:val="es-ES_tradnl"/>
         </w:rPr>
-        <w:t/>
-      </w:r>
-      <w:r>
-        <w:rPr>
-          <w:rFonts w:ascii="Times New Roman" w:hAnsi="Times New Roman" w:cs="Times New Roman"/>
-          <w:color w:val="000000"/>
-          <w:sz w:val="24"/>
-          <w:szCs w:val="24"/>
-          <w:lang w:val="es-ES_tradnl"/>
-        </w:rPr>
         <w:t xml:space="preserve">, como </w:t>
       </w:r>
       <w:r>
@@ -695,55 +612,7 @@
           <w:szCs w:val="24"/>
           <w:lang w:val="es-ES_tradnl"/>
         </w:rPr>
-        <w:t xml:space="preserve">LOTE </w:t>
-      </w:r>
-      <w:r>
-        <w:rPr>
-          <w:rFonts w:ascii="Times New Roman" w:hAnsi="Times New Roman" w:cs="Times New Roman"/>
-          <w:b/>
-          <w:bCs/>
-          <w:color w:val="000000"/>
-          <w:sz w:val="24"/>
-          <w:szCs w:val="24"/>
-          <w:lang w:val="es-ES_tradnl"/>
-        </w:rPr>
-        <w:t>{lote}</w:t>
-      </w:r>
-      <w:r>
-        <w:rPr>
-          <w:rFonts w:ascii="Times New Roman" w:hAnsi="Times New Roman" w:cs="Times New Roman"/>
-          <w:b/>
-          <w:bCs/>
-          <w:color w:val="000000"/>
-          <w:sz w:val="24"/>
-          <w:szCs w:val="24"/>
-          <w:lang w:val="es-ES_tradnl"/>
-        </w:rPr>
-        <w:t xml:space="preserve"> DE LA MANZANA </w:t>
-      </w:r>
-      <w:r>
-        <w:rPr>
-          <w:rFonts w:ascii="Times New Roman" w:hAnsi="Times New Roman" w:cs="Times New Roman"/>
-          <w:b/>
-          <w:bCs/>
-          <w:color w:val="000000"/>
-          <w:sz w:val="24"/>
-          <w:szCs w:val="24"/>
-          <w:lang w:val="es-ES_tradnl"/>
-        </w:rPr>
-        <w:t>{manzana}</w:t>
-      </w:r>
-      <w:r>
-        <w:rPr>
-          <w:rFonts w:ascii="Times New Roman" w:hAnsi="Times New Roman" w:cs="Times New Roman"/>
-          <w:b/>
-          <w:bCs/>
-          <w:color w:val="000000"/>
-          <w:sz w:val="24"/>
-          <w:szCs w:val="24"/>
-          <w:lang w:val="es-ES_tradnl"/>
-        </w:rPr>
-        <w:t/>
+        <w:t>LOTE {lote} DE LA MANZANA {manzana}</w:t>
       </w:r>
       <w:r>
         <w:rPr>
@@ -773,27 +642,7 @@
           <w:szCs w:val="24"/>
           <w:lang w:val="es-ES_tradnl"/>
         </w:rPr>
-        <w:t/>
-      </w:r>
-      <w:r>
-        <w:rPr>
-          <w:rFonts w:ascii="Times New Roman" w:hAnsi="Times New Roman" w:cs="Times New Roman"/>
-          <w:color w:val="000000"/>
-          <w:sz w:val="24"/>
-          <w:szCs w:val="24"/>
-          <w:lang w:val="es-ES_tradnl"/>
-        </w:rPr>
         <w:t>{medidas}</w:t>
-      </w:r>
-      <w:r>
-        <w:rPr>
-          <w:rFonts w:ascii="Times New Roman" w:hAnsi="Times New Roman" w:cs="Times New Roman"/>
-          <w:color w:val="000000"/>
-          <w:sz w:val="24"/>
-          <w:szCs w:val="24"/>
-          <w:lang w:val="es-ES_tradnl"/>
-        </w:rPr>
-        <w:t/>
       </w:r>
       <w:r>
         <w:rPr>
@@ -878,47 +727,7 @@
           <w:szCs w:val="24"/>
           <w:lang w:val="es-ES_tradnl"/>
         </w:rPr>
-        <w:t xml:space="preserve">, Manzana </w:t>
-      </w:r>
-      <w:r>
-        <w:rPr>
-          <w:rFonts w:ascii="Times New Roman" w:hAnsi="Times New Roman" w:cs="Times New Roman"/>
-          <w:color w:val="000000"/>
-          <w:sz w:val="24"/>
-          <w:szCs w:val="24"/>
-          <w:lang w:val="es-ES_tradnl"/>
-        </w:rPr>
-        <w:t>{manzanaCatastral}</w:t>
-      </w:r>
-      <w:r>
-        <w:rPr>
-          <w:rFonts w:ascii="Times New Roman" w:hAnsi="Times New Roman" w:cs="Times New Roman"/>
-          <w:color w:val="000000"/>
-          <w:sz w:val="24"/>
-          <w:szCs w:val="24"/>
-          <w:lang w:val="es-ES_tradnl"/>
-        </w:rPr>
-        <w:t xml:space="preserve">, Parcela </w:t>
-      </w:r>
-      <w:r>
-        <w:rPr>
-          <w:rFonts w:ascii="Times New Roman" w:hAnsi="Times New Roman" w:cs="Times New Roman"/>
-          <w:color w:val="000000"/>
-          <w:sz w:val="24"/>
-          <w:szCs w:val="24"/>
-          <w:lang w:val="es-ES_tradnl"/>
-        </w:rPr>
-        <w:t>{parcelaCatastral}</w:t>
-      </w:r>
-      <w:r>
-        <w:rPr>
-          <w:rFonts w:ascii="Times New Roman" w:hAnsi="Times New Roman" w:cs="Times New Roman"/>
-          <w:color w:val="000000"/>
-          <w:sz w:val="24"/>
-          <w:szCs w:val="24"/>
-          <w:lang w:val="es-ES_tradnl"/>
-        </w:rPr>
-        <w:t xml:space="preserve">.- </w:t>
+        <w:t xml:space="preserve">, Manzana {manzanaCatastral}, Parcela {parcelaCatastral}.- </w:t>
       </w:r>
       <w:r>
         <w:rPr>
@@ -963,27 +772,7 @@
           <w:szCs w:val="24"/>
           <w:lang w:val="es-ES_tradnl"/>
         </w:rPr>
-        <w:t/>
-      </w:r>
-      <w:r>
-        <w:rPr>
-          <w:rFonts w:ascii="Times New Roman" w:hAnsi="Times New Roman" w:cs="Times New Roman"/>
-          <w:color w:val="000000"/>
-          <w:sz w:val="24"/>
-          <w:szCs w:val="24"/>
-          <w:lang w:val="es-ES_tradnl"/>
-        </w:rPr>
-        <w:t>{partida}</w:t>
-      </w:r>
-      <w:r>
-        <w:rPr>
-          <w:rFonts w:ascii="Times New Roman" w:hAnsi="Times New Roman" w:cs="Times New Roman"/>
-          <w:color w:val="000000"/>
-          <w:sz w:val="24"/>
-          <w:szCs w:val="24"/>
-          <w:lang w:val="es-ES_tradnl"/>
-        </w:rPr>
-        <w:t xml:space="preserve">.- </w:t>
+        <w:t xml:space="preserve">{partida}.- </w:t>
       </w:r>
       <w:r>
         <w:rPr>
@@ -1166,16 +955,6 @@
           <w:szCs w:val="24"/>
           <w:lang w:val="es-ES_tradnl"/>
         </w:rPr>
-        <w:t/>
-      </w:r>
-      <w:r>
-        <w:rPr>
-          <w:rFonts w:ascii="Times New Roman" w:hAnsi="Times New Roman" w:cs="Times New Roman"/>
-          <w:color w:val="000000"/>
-          <w:sz w:val="24"/>
-          <w:szCs w:val="24"/>
-          <w:lang w:val="es-ES_tradnl"/>
-        </w:rPr>
         <w:t>{escritura}</w:t>
       </w:r>
       <w:r>
@@ -1186,16 +965,6 @@
           <w:szCs w:val="24"/>
           <w:lang w:val="es-ES_tradnl"/>
         </w:rPr>
-        <w:t/>
-      </w:r>
-      <w:r>
-        <w:rPr>
-          <w:rFonts w:ascii="Times New Roman" w:hAnsi="Times New Roman" w:cs="Times New Roman"/>
-          <w:color w:val="000000"/>
-          <w:sz w:val="24"/>
-          <w:szCs w:val="24"/>
-          <w:lang w:val="es-ES_tradnl"/>
-        </w:rPr>
         <w:t xml:space="preserve"> de fecha </w:t>
       </w:r>
       <w:r>
@@ -1206,16 +975,6 @@
           <w:szCs w:val="24"/>
           <w:lang w:val="es-ES_tradnl"/>
         </w:rPr>
-        <w:t/>
-      </w:r>
-      <w:r>
-        <w:rPr>
-          <w:rFonts w:ascii="Times New Roman" w:hAnsi="Times New Roman" w:cs="Times New Roman"/>
-          <w:color w:val="000000"/>
-          <w:sz w:val="24"/>
-          <w:szCs w:val="24"/>
-          <w:lang w:val="es-ES_tradnl"/>
-        </w:rPr>
         <w:t>{fechaEscritura}</w:t>
       </w:r>
       <w:r>
@@ -1226,16 +985,6 @@
           <w:szCs w:val="24"/>
           <w:lang w:val="es-ES_tradnl"/>
         </w:rPr>
-        <w:t/>
-      </w:r>
-      <w:r>
-        <w:rPr>
-          <w:rFonts w:ascii="Times New Roman" w:hAnsi="Times New Roman" w:cs="Times New Roman"/>
-          <w:color w:val="000000"/>
-          <w:sz w:val="24"/>
-          <w:szCs w:val="24"/>
-          <w:lang w:val="es-ES_tradnl"/>
-        </w:rPr>
         <w:t xml:space="preserve">, pasada ante el Escribano de </w:t>
       </w:r>
       <w:r>
@@ -1286,7 +1035,6 @@
           <w:szCs w:val="24"/>
           <w:lang w:val="es-ES_tradnl"/>
         </w:rPr>
-        <w:lastRenderedPageBreak/>
         <w:t xml:space="preserve">Sebastián E. Nadela, al folio </w:t>
       </w:r>
       <w:r>
@@ -1297,16 +1045,6 @@
           <w:szCs w:val="24"/>
           <w:lang w:val="es-ES_tradnl"/>
         </w:rPr>
-        <w:t/>
-      </w:r>
-      <w:r>
-        <w:rPr>
-          <w:rFonts w:ascii="Times New Roman" w:hAnsi="Times New Roman" w:cs="Times New Roman"/>
-          <w:color w:val="000000"/>
-          <w:sz w:val="24"/>
-          <w:szCs w:val="24"/>
-          <w:lang w:val="es-ES_tradnl"/>
-        </w:rPr>
         <w:t>{folio}</w:t>
       </w:r>
       <w:r>
@@ -1317,16 +1055,6 @@
           <w:szCs w:val="24"/>
           <w:lang w:val="es-ES_tradnl"/>
         </w:rPr>
-        <w:t/>
-      </w:r>
-      <w:r>
-        <w:rPr>
-          <w:rFonts w:ascii="Times New Roman" w:hAnsi="Times New Roman" w:cs="Times New Roman"/>
-          <w:color w:val="000000"/>
-          <w:sz w:val="24"/>
-          <w:szCs w:val="24"/>
-          <w:lang w:val="es-ES_tradnl"/>
-        </w:rPr>
         <w:t xml:space="preserve"> del Registro 1.453 a su cargo,</w:t>
       </w:r>
       <w:r>
@@ -1367,27 +1095,7 @@
           <w:szCs w:val="24"/>
           <w:lang w:val="es-ES_tradnl"/>
         </w:rPr>
-        <w:t/>
-      </w:r>
-      <w:r>
-        <w:rPr>
-          <w:rFonts w:ascii="Times New Roman" w:hAnsi="Times New Roman" w:cs="Times New Roman"/>
-          <w:color w:val="000000"/>
-          <w:sz w:val="24"/>
-          <w:szCs w:val="24"/>
-          <w:lang w:val="es-ES_tradnl"/>
-        </w:rPr>
         <w:t>{fechaInscripcion}</w:t>
-      </w:r>
-      <w:r>
-        <w:rPr>
-          <w:rFonts w:ascii="Times New Roman" w:hAnsi="Times New Roman" w:cs="Times New Roman"/>
-          <w:color w:val="000000"/>
-          <w:sz w:val="24"/>
-          <w:szCs w:val="24"/>
-          <w:lang w:val="es-ES_tradnl"/>
-        </w:rPr>
-        <w:t/>
       </w:r>
       <w:r>
         <w:rPr>
@@ -1775,27 +1483,18 @@
           <w:szCs w:val="24"/>
           <w:lang w:val="es-ES_tradnl"/>
         </w:rPr>
-        <w:t xml:space="preserve"/>
-      </w:r>
-      <w:r>
-        <w:rPr>
-          <w:rFonts w:ascii="Times New Roman" w:hAnsi="Times New Roman" w:cs="Times New Roman"/>
-          <w:color w:val="000000"/>
-          <w:sz w:val="24"/>
-          <w:szCs w:val="24"/>
-          <w:lang w:val="es-ES_tradnl"/>
-        </w:rPr>
-        <w:t xml:space="preserve"> serán abonados por la PARTE COMPRADORA a la PARTE VENDEDORA en billetes de dicha moneda, {#sinCuotas}en un único pago.-{/sinCuotas}{#tieneCuotas}en {cantidadCuotas} cuotas mensuales, iguales y consecutivas de DÓLARES ESTADOUNIDENSES BILLETE {cuotaMensualPalabras} (U$S {cuotaMensual}) cada una, a partir de la fecha de suscripción del presente.-{/tieneCuotas}</w:t>
-      </w:r>
-      <w:r>
-        <w:rPr>
-          <w:rFonts w:ascii="Times New Roman" w:hAnsi="Times New Roman" w:cs="Times New Roman"/>
-          <w:color w:val="000000"/>
-          <w:sz w:val="24"/>
-          <w:szCs w:val="24"/>
-          <w:lang w:val="es-ES_tradnl"/>
-        </w:rPr>
-        <w:t> Ambas partes manifiestan que otorgan plena validez al pago que se efectúan mediante el presente y expresan que no tienen reclamo que formularse y renuncian a invocar las acciones establecidas en los artículos 1083 a 1088 del Código Civil y Comercial de la Nación respecto al pacto comisorio, como así también renuncian a cualquier acción que les pudiera corresponder por incumplimiento de la ley 25.345. Las partes renuncian a la facultad de arrepentimiento prevista por el artículo 1059 del mencionado Código.- </w:t>
+        <w:t xml:space="preserve"> serán abonados por la PARTE COMPRADORA a la PARTE VENDEDORA en billetes de dicha moneda, {#sinCuotas}en un único pago.-{/sinCuotas}{#tieneCuotas}en {cantidadCuotas} cuotas mensuales, iguales y consecutivas de DÓLARES ESTADOUNIDENSES </w:t>
+      </w:r>
+      <w:r>
+        <w:rPr>
+          <w:rFonts w:ascii="Times New Roman" w:hAnsi="Times New Roman" w:cs="Times New Roman"/>
+          <w:color w:val="000000"/>
+          <w:sz w:val="24"/>
+          <w:szCs w:val="24"/>
+          <w:lang w:val="es-ES_tradnl"/>
+        </w:rPr>
+        <w:lastRenderedPageBreak/>
+        <w:t>BILLETE {cuotaMensualPalabras} (U$S {cuotaMensual}) cada una, a partir de la fecha de suscripción del presente.-{/tieneCuotas}Ambas partes manifiestan que otorgan plena validez al pago que se efectúan mediante el presente y expresan que no tienen reclamo que formularse y renuncian a invocar las acciones establecidas en los artículos 1083 a 1088 del Código Civil y Comercial de la Nación respecto al pacto comisorio, como así también renuncian a cualquier acción que les pudiera corresponder por incumplimiento de la ley 25.345. Las partes renuncian a la facultad de arrepentimiento prevista por el artículo 1059 del mencionado Código.-</w:t>
       </w:r>
     </w:p>
     <w:p>
@@ -1846,18 +1545,7 @@
           <w:szCs w:val="24"/>
           <w:lang w:val="es-ES_tradnl"/>
         </w:rPr>
-        <w:t xml:space="preserve">Las partes acuerdan que el precio se ha convenido en dólares estadounidenses billetes, como moneda de contrato, en los términos del artículo 766 del Código Civil y Comercial de la Nación. Ambas partes renuncian a lo estatuido en el artículo 765 del mismo ordenamiento legal, de acuerdo a lo establecido en el artículo 13 ya que los efectos de la ley pueden ser renunciados en el caso particular </w:t>
-      </w:r>
-      <w:r>
-        <w:rPr>
-          <w:rFonts w:ascii="Times New Roman" w:hAnsi="Times New Roman" w:cs="Times New Roman"/>
-          <w:color w:val="000000"/>
-          <w:sz w:val="24"/>
-          <w:szCs w:val="24"/>
-          <w:lang w:val="es-ES_tradnl"/>
-        </w:rPr>
-        <w:lastRenderedPageBreak/>
-        <w:t xml:space="preserve">por no estar prohibido por el ordenamiento jurídico. Por tratarse de una obligación de género se establece que la elección queda en cabeza de </w:t>
+        <w:t xml:space="preserve">Las partes acuerdan que el precio se ha convenido en dólares estadounidenses billetes, como moneda de contrato, en los términos del artículo 766 del Código Civil y Comercial de la Nación. Ambas partes renuncian a lo estatuido en el artículo 765 del mismo ordenamiento legal, de acuerdo a lo establecido en el artículo 13 ya que los efectos de la ley pueden ser renunciados en el caso particular por no estar prohibido por el ordenamiento jurídico. Por tratarse de una obligación de género se establece que la elección queda en cabeza de </w:t>
       </w:r>
       <w:r>
         <w:rPr>
@@ -2054,7 +1742,18 @@
           <w:szCs w:val="24"/>
           <w:lang w:val="es-ES_tradnl"/>
         </w:rPr>
-        <w:t xml:space="preserve">Esta venta se realiza en base a títulos perfectos y no observables, libre de toda deuda, y libres de todo gravamen o cualquier imperfección que sea considerada doctrinariamente, como así también libre de inhibiciones, con todos los impuestos, servicios, tasas, expensas y contribuciones, totalmente canceladas a la fecha de escrituración, a cuya evicción y saneamiento con arreglo a derecho se obliga </w:t>
+        <w:t xml:space="preserve">Esta venta se realiza en base a títulos perfectos y no observables, libre de toda deuda, y libres de todo gravamen o cualquier imperfección que sea considerada </w:t>
+      </w:r>
+      <w:r>
+        <w:rPr>
+          <w:rFonts w:ascii="Times New Roman" w:hAnsi="Times New Roman" w:cs="Times New Roman"/>
+          <w:color w:val="000000"/>
+          <w:sz w:val="24"/>
+          <w:szCs w:val="24"/>
+          <w:lang w:val="es-ES_tradnl"/>
+        </w:rPr>
+        <w:lastRenderedPageBreak/>
+        <w:t xml:space="preserve">doctrinariamente, como así también libre de inhibiciones, con todos los impuestos, servicios, tasas, expensas y contribuciones, totalmente canceladas a la fecha de escrituración, a cuya evicción y saneamiento con arreglo a derecho se obliga </w:t>
       </w:r>
       <w:r>
         <w:rPr>
@@ -2253,18 +1952,6 @@
           <w:szCs w:val="24"/>
           <w:lang w:val="es-ES_tradnl"/>
         </w:rPr>
-        <w:t/>
-      </w:r>
-      <w:r>
-        <w:rPr>
-          <w:rFonts w:ascii="Times New Roman" w:hAnsi="Times New Roman" w:cs="Times New Roman"/>
-          <w:b/>
-          <w:bCs/>
-          <w:color w:val="000000"/>
-          <w:sz w:val="24"/>
-          <w:szCs w:val="24"/>
-          <w:lang w:val="es-ES_tradnl"/>
-        </w:rPr>
         <w:t>CIENTO OCHENTA DÍAS</w:t>
       </w:r>
       <w:r>
@@ -2292,18 +1979,6 @@
       <w:r>
         <w:rPr>
           <w:rFonts w:ascii="Times New Roman" w:hAnsi="Times New Roman" w:cs="Times New Roman"/>
-          <w:b/>
-          <w:bCs/>
-          <w:color w:val="000000"/>
-          <w:sz w:val="24"/>
-          <w:szCs w:val="24"/>
-          <w:lang w:val="es-ES_tradnl"/>
-        </w:rPr>
-        <w:t/>
-      </w:r>
-      <w:r>
-        <w:rPr>
-          <w:rFonts w:ascii="Times New Roman" w:hAnsi="Times New Roman" w:cs="Times New Roman"/>
           <w:color w:val="000000"/>
           <w:sz w:val="24"/>
           <w:szCs w:val="24"/>
@@ -2351,18 +2026,7 @@
           <w:szCs w:val="24"/>
           <w:lang w:val="es-ES_tradnl"/>
         </w:rPr>
-        <w:t xml:space="preserve">a quien las partes </w:t>
-      </w:r>
-      <w:r>
-        <w:rPr>
-          <w:rFonts w:ascii="Times New Roman" w:hAnsi="Times New Roman" w:cs="Times New Roman"/>
-          <w:color w:val="000000"/>
-          <w:sz w:val="24"/>
-          <w:szCs w:val="24"/>
-          <w:lang w:val="es-ES_tradnl"/>
-        </w:rPr>
-        <w:lastRenderedPageBreak/>
-        <w:t>facultan para hacer las citaciones y emplazamientos de Acto Notarial. La fecha máxima de escrituración prevista podrá prorrogarse en caso que el trámite a realizar en el expediente sucesorio sufriera demoras por causas ajenas a la diligencia de la parte vendedora.-  Las partes asimismo se obligan a hacer entrega de la documentación correspondiente, como ser títulos originales.- El pago de tasas, sellados, impuestos y demás erogaciones emergentes de la escritura traslativa de dominio serán abonados por las partes de acuerdo a la ley, usos y costumbres notariales.- De corresponder el impuesto de sellos será afrontado por las partes en proporciones iguales.</w:t>
+        <w:t>a quien las partes facultan para hacer las citaciones y emplazamientos de Acto Notarial. La fecha máxima de escrituración prevista podrá prorrogarse en caso que el trámite a realizar en el expediente sucesorio sufriera demoras por causas ajenas a la diligencia de la parte vendedora.-  Las partes asimismo se obligan a hacer entrega de la documentación correspondiente, como ser títulos originales.- El pago de tasas, sellados, impuestos y demás erogaciones emergentes de la escritura traslativa de dominio serán abonados por las partes de acuerdo a la ley, usos y costumbres notariales.- De corresponder el impuesto de sellos será afrontado por las partes en proporciones iguales.</w:t>
       </w:r>
     </w:p>
     <w:p>
@@ -2467,7 +2131,17 @@
           <w:szCs w:val="24"/>
           <w:lang w:val="es-ES_tradnl"/>
         </w:rPr>
-        <w:t xml:space="preserve"> podrá optar por: A) Exigir su total cumplimiento más el pago de una multa diaria de Dólares Estadounidenses Billetes doscientos (U$S 200), sea día hábil o inhábil, en concepto de cláusula penal, la que se devengará automáticamente, sin necesidad de interpelación judicial o extrajudicial alguna, hasta el efectivo cumplimiento de </w:t>
+        <w:t xml:space="preserve"> podrá optar por: A) Exigir su total cumplimiento más el pago de una multa diaria de Dólares </w:t>
+      </w:r>
+      <w:r>
+        <w:rPr>
+          <w:rFonts w:ascii="Times New Roman" w:hAnsi="Times New Roman" w:cs="Times New Roman"/>
+          <w:sz w:val="24"/>
+          <w:szCs w:val="24"/>
+          <w:lang w:val="es-ES_tradnl"/>
+        </w:rPr>
+        <w:lastRenderedPageBreak/>
+        <w:t xml:space="preserve">Estadounidenses Billetes doscientos (U$S 200), sea día hábil o inhábil, en concepto de cláusula penal, la que se devengará automáticamente, sin necesidad de interpelación judicial o extrajudicial alguna, hasta el efectivo cumplimiento de </w:t>
       </w:r>
       <w:r>
         <w:rPr>
@@ -2665,7 +2339,115 @@
           <w:szCs w:val="24"/>
           <w:lang w:val="es-ES_tradnl"/>
         </w:rPr>
-        <w:t xml:space="preserve">, automáticamente, por el solo transcurso del tiempo, de pleno derecho y sin necesidad de interpelación ni trámite alguno, judicial o extrajudicial, hasta el efectivo cumplimiento de LA PARTE VENDEDORA, el </w:t>
+        <w:t xml:space="preserve">, automáticamente, por el solo transcurso del tiempo, de pleno derecho y sin necesidad de interpelación ni trámite alguno, judicial o extrajudicial, hasta el efectivo cumplimiento de LA PARTE VENDEDORA, el monto así determinado podrá ser deducido del saldo de precio o reclamarse judicialmente por la vía ejecutiva, teniéndose presente que el pago de la pena, cualquiera fuese su monto, no extinguirá el derecho de </w:t>
+      </w:r>
+      <w:r>
+        <w:rPr>
+          <w:rFonts w:ascii="Times New Roman" w:hAnsi="Times New Roman" w:cs="Times New Roman"/>
+          <w:sz w:val="24"/>
+          <w:szCs w:val="24"/>
+          <w:lang w:val="es-ES_tradnl"/>
+        </w:rPr>
+        <w:t xml:space="preserve">la </w:t>
+      </w:r>
+      <w:r>
+        <w:rPr>
+          <w:rFonts w:ascii="Times New Roman" w:hAnsi="Times New Roman" w:cs="Times New Roman"/>
+          <w:b/>
+          <w:bCs/>
+          <w:sz w:val="24"/>
+          <w:szCs w:val="24"/>
+          <w:lang w:val="es-ES_tradnl"/>
+        </w:rPr>
+        <w:t>PARTE COMPRADORA</w:t>
+      </w:r>
+      <w:r>
+        <w:rPr>
+          <w:rFonts w:ascii="Times New Roman" w:hAnsi="Times New Roman" w:cs="Times New Roman"/>
+          <w:sz w:val="24"/>
+          <w:szCs w:val="24"/>
+          <w:lang w:val="es-ES_tradnl"/>
+        </w:rPr>
+        <w:t xml:space="preserve"> </w:t>
+      </w:r>
+      <w:r>
+        <w:rPr>
+          <w:rFonts w:ascii="Times New Roman" w:hAnsi="Times New Roman" w:cs="Times New Roman"/>
+          <w:sz w:val="24"/>
+          <w:szCs w:val="24"/>
+          <w:lang w:val="es-ES_tradnl"/>
+        </w:rPr>
+        <w:t xml:space="preserve">a solicitar el cumplimiento de las obligaciones principales; o B) Rescindir el contrato de pleno derecho, debiendo </w:t>
+      </w:r>
+      <w:r>
+        <w:rPr>
+          <w:rFonts w:ascii="Times New Roman" w:hAnsi="Times New Roman" w:cs="Times New Roman"/>
+          <w:color w:val="000000"/>
+          <w:sz w:val="24"/>
+          <w:szCs w:val="24"/>
+          <w:lang w:val="es-ES_tradnl"/>
+        </w:rPr>
+        <w:t xml:space="preserve">la </w:t>
+      </w:r>
+      <w:r>
+        <w:rPr>
+          <w:rFonts w:ascii="Times New Roman" w:hAnsi="Times New Roman" w:cs="Times New Roman"/>
+          <w:b/>
+          <w:bCs/>
+          <w:color w:val="000000"/>
+          <w:sz w:val="24"/>
+          <w:szCs w:val="24"/>
+          <w:lang w:val="es-ES_tradnl"/>
+        </w:rPr>
+        <w:t>PARTE VENDEDORA</w:t>
+      </w:r>
+      <w:r>
+        <w:rPr>
+          <w:rFonts w:ascii="Times New Roman" w:hAnsi="Times New Roman" w:cs="Times New Roman"/>
+          <w:color w:val="000000"/>
+          <w:sz w:val="24"/>
+          <w:szCs w:val="24"/>
+          <w:lang w:val="es-ES_tradnl"/>
+        </w:rPr>
+        <w:t xml:space="preserve"> </w:t>
+      </w:r>
+      <w:r>
+        <w:rPr>
+          <w:rFonts w:ascii="Times New Roman" w:hAnsi="Times New Roman" w:cs="Times New Roman"/>
+          <w:sz w:val="24"/>
+          <w:szCs w:val="24"/>
+          <w:lang w:val="es-ES_tradnl"/>
+        </w:rPr>
+        <w:t xml:space="preserve">entregar a </w:t>
+      </w:r>
+      <w:r>
+        <w:rPr>
+          <w:rFonts w:ascii="Times New Roman" w:hAnsi="Times New Roman" w:cs="Times New Roman"/>
+          <w:sz w:val="24"/>
+          <w:szCs w:val="24"/>
+          <w:lang w:val="es-ES_tradnl"/>
+        </w:rPr>
+        <w:t xml:space="preserve">la </w:t>
+      </w:r>
+      <w:r>
+        <w:rPr>
+          <w:rFonts w:ascii="Times New Roman" w:hAnsi="Times New Roman" w:cs="Times New Roman"/>
+          <w:b/>
+          <w:bCs/>
+          <w:sz w:val="24"/>
+          <w:szCs w:val="24"/>
+          <w:lang w:val="es-ES_tradnl"/>
+        </w:rPr>
+        <w:t>PARTE COMPRADORA</w:t>
+      </w:r>
+      <w:r>
+        <w:rPr>
+          <w:rFonts w:ascii="Times New Roman" w:hAnsi="Times New Roman" w:cs="Times New Roman"/>
+          <w:sz w:val="24"/>
+          <w:szCs w:val="24"/>
+          <w:lang w:val="es-ES_tradnl"/>
+        </w:rPr>
+        <w:t xml:space="preserve"> la suma recibida en este acto, con más otra suma igual en concepto de indemnización, dentro de las 48 horas de producida la mora, sin necesidad de interpelación judicial o extrajudicial, con facultad para iniciar las acciones que correspondan. En este último caso será aplicable lo establecido por el artículo tercero del presente boleto, en lo que se refiere al pago en dólares estadounidenses. Para todos los efectos de este Boleto de compraventa, las partes acuerdan que la mora se </w:t>
       </w:r>
       <w:r>
         <w:rPr>
@@ -2675,115 +2457,7 @@
           <w:lang w:val="es-ES_tradnl"/>
         </w:rPr>
         <w:lastRenderedPageBreak/>
-        <w:t xml:space="preserve">monto así determinado podrá ser deducido del saldo de precio o reclamarse judicialmente por la vía ejecutiva, teniéndose presente que el pago de la pena, cualquiera fuese su monto, no extinguirá el derecho de </w:t>
-      </w:r>
-      <w:r>
-        <w:rPr>
-          <w:rFonts w:ascii="Times New Roman" w:hAnsi="Times New Roman" w:cs="Times New Roman"/>
-          <w:sz w:val="24"/>
-          <w:szCs w:val="24"/>
-          <w:lang w:val="es-ES_tradnl"/>
-        </w:rPr>
-        <w:t xml:space="preserve">la </w:t>
-      </w:r>
-      <w:r>
-        <w:rPr>
-          <w:rFonts w:ascii="Times New Roman" w:hAnsi="Times New Roman" w:cs="Times New Roman"/>
-          <w:b/>
-          <w:bCs/>
-          <w:sz w:val="24"/>
-          <w:szCs w:val="24"/>
-          <w:lang w:val="es-ES_tradnl"/>
-        </w:rPr>
-        <w:t>PARTE COMPRADORA</w:t>
-      </w:r>
-      <w:r>
-        <w:rPr>
-          <w:rFonts w:ascii="Times New Roman" w:hAnsi="Times New Roman" w:cs="Times New Roman"/>
-          <w:sz w:val="24"/>
-          <w:szCs w:val="24"/>
-          <w:lang w:val="es-ES_tradnl"/>
-        </w:rPr>
-        <w:t xml:space="preserve"> </w:t>
-      </w:r>
-      <w:r>
-        <w:rPr>
-          <w:rFonts w:ascii="Times New Roman" w:hAnsi="Times New Roman" w:cs="Times New Roman"/>
-          <w:sz w:val="24"/>
-          <w:szCs w:val="24"/>
-          <w:lang w:val="es-ES_tradnl"/>
-        </w:rPr>
-        <w:t xml:space="preserve">a solicitar el cumplimiento de las obligaciones principales; o B) Rescindir el contrato de pleno derecho, debiendo </w:t>
-      </w:r>
-      <w:r>
-        <w:rPr>
-          <w:rFonts w:ascii="Times New Roman" w:hAnsi="Times New Roman" w:cs="Times New Roman"/>
-          <w:color w:val="000000"/>
-          <w:sz w:val="24"/>
-          <w:szCs w:val="24"/>
-          <w:lang w:val="es-ES_tradnl"/>
-        </w:rPr>
-        <w:t xml:space="preserve">la </w:t>
-      </w:r>
-      <w:r>
-        <w:rPr>
-          <w:rFonts w:ascii="Times New Roman" w:hAnsi="Times New Roman" w:cs="Times New Roman"/>
-          <w:b/>
-          <w:bCs/>
-          <w:color w:val="000000"/>
-          <w:sz w:val="24"/>
-          <w:szCs w:val="24"/>
-          <w:lang w:val="es-ES_tradnl"/>
-        </w:rPr>
-        <w:t>PARTE VENDEDORA</w:t>
-      </w:r>
-      <w:r>
-        <w:rPr>
-          <w:rFonts w:ascii="Times New Roman" w:hAnsi="Times New Roman" w:cs="Times New Roman"/>
-          <w:color w:val="000000"/>
-          <w:sz w:val="24"/>
-          <w:szCs w:val="24"/>
-          <w:lang w:val="es-ES_tradnl"/>
-        </w:rPr>
-        <w:t xml:space="preserve"> </w:t>
-      </w:r>
-      <w:r>
-        <w:rPr>
-          <w:rFonts w:ascii="Times New Roman" w:hAnsi="Times New Roman" w:cs="Times New Roman"/>
-          <w:sz w:val="24"/>
-          <w:szCs w:val="24"/>
-          <w:lang w:val="es-ES_tradnl"/>
-        </w:rPr>
-        <w:t xml:space="preserve">entregar a </w:t>
-      </w:r>
-      <w:r>
-        <w:rPr>
-          <w:rFonts w:ascii="Times New Roman" w:hAnsi="Times New Roman" w:cs="Times New Roman"/>
-          <w:sz w:val="24"/>
-          <w:szCs w:val="24"/>
-          <w:lang w:val="es-ES_tradnl"/>
-        </w:rPr>
-        <w:t xml:space="preserve">la </w:t>
-      </w:r>
-      <w:r>
-        <w:rPr>
-          <w:rFonts w:ascii="Times New Roman" w:hAnsi="Times New Roman" w:cs="Times New Roman"/>
-          <w:b/>
-          <w:bCs/>
-          <w:sz w:val="24"/>
-          <w:szCs w:val="24"/>
-          <w:lang w:val="es-ES_tradnl"/>
-        </w:rPr>
-        <w:t>PARTE COMPRADORA</w:t>
-      </w:r>
-      <w:r>
-        <w:rPr>
-          <w:rFonts w:ascii="Times New Roman" w:hAnsi="Times New Roman" w:cs="Times New Roman"/>
-          <w:sz w:val="24"/>
-          <w:szCs w:val="24"/>
-          <w:lang w:val="es-ES_tradnl"/>
-        </w:rPr>
-        <w:t xml:space="preserve"> la suma recibida en este acto, con más otra suma igual en concepto de indemnización, dentro de las 48 horas de producida la mora, sin necesidad de interpelación judicial o extrajudicial, con facultad para iniciar las acciones que correspondan. En este último caso será aplicable lo establecido por el artículo tercero del presente boleto, en lo que se refiere al pago en dólares estadounidenses. Para todos los efectos de este Boleto de compraventa, las partes acuerdan que la mora se producirá de pleno derecho previa intimación fehaciente al cumplimiento por 10 días, mediante carta documento.-  </w:t>
+        <w:t xml:space="preserve">producirá de pleno derecho previa intimación fehaciente al cumplimiento por 10 días, mediante carta documento.-  </w:t>
       </w:r>
     </w:p>
     <w:p>
@@ -2924,17 +2598,7 @@
           <w:szCs w:val="24"/>
           <w:lang w:val="es-ES_tradnl"/>
         </w:rPr>
-        <w:t xml:space="preserve">Las partes se someten a los Tribunales en lo Civil de la Justicia Ordinaria de la Capital Federal, Ciudad Autónoma de Buenos Aires, renunciando a todo otro fuero o jurisdicción que pudiera corresponder, constituyendo domicilio especial en </w:t>
-      </w:r>
-      <w:r>
-        <w:rPr>
-          <w:rFonts w:ascii="Times New Roman" w:hAnsi="Times New Roman" w:cs="Times New Roman"/>
-          <w:sz w:val="24"/>
-          <w:szCs w:val="24"/>
-          <w:lang w:val="es-ES_tradnl"/>
-        </w:rPr>
-        <w:lastRenderedPageBreak/>
-        <w:t xml:space="preserve">los indicados al comienzo de la presente, donde serán válidas todas las notificaciones, citaciones y emplazamientos que fueren menester realizar.- </w:t>
+        <w:t xml:space="preserve">Las partes se someten a los Tribunales en lo Civil de la Justicia Ordinaria de la Capital Federal, Ciudad Autónoma de Buenos Aires, renunciando a todo otro fuero o jurisdicción que pudiera corresponder, constituyendo domicilio especial en los indicados al comienzo de la presente, donde serán válidas todas las notificaciones, citaciones y emplazamientos que fueren menester realizar.- </w:t>
       </w:r>
     </w:p>
     <w:p>
@@ -3059,7 +2723,7 @@
 </file>
 
 <file path=word/styles.xml><?xml version="1.0" encoding="utf-8"?>
-<w:styles xmlns:mc="http://schemas.openxmlformats.org/markup-compatibility/2006" xmlns:r="http://schemas.openxmlformats.org/officeDocument/2006/relationships" xmlns:w="http://schemas.openxmlformats.org/wordprocessingml/2006/main" xmlns:w14="http://schemas.microsoft.com/office/word/2010/wordml" xmlns:w15="http://schemas.microsoft.com/office/word/2012/wordml" xmlns:w16cex="http://schemas.microsoft.com/office/word/2018/wordml/cex" xmlns:w16cid="http://schemas.microsoft.com/office/word/2016/wordml/cid" xmlns:w16="http://schemas.microsoft.com/office/word/2018/wordml" xmlns:w16se="http://schemas.microsoft.com/office/word/2015/wordml/symex" mc:Ignorable="w14 w15 w16se w16cid w16 w16cex">
+<w:styles xmlns:mc="http://schemas.openxmlformats.org/markup-compatibility/2006" xmlns:r="http://schemas.openxmlformats.org/officeDocument/2006/relationships" xmlns:w="http://schemas.openxmlformats.org/wordprocessingml/2006/main" xmlns:w14="http://schemas.microsoft.com/office/word/2010/wordml" xmlns:w15="http://schemas.microsoft.com/office/word/2012/wordml" xmlns:w16cex="http://schemas.microsoft.com/office/word/2018/wordml/cex" xmlns:w16cid="http://schemas.microsoft.com/office/word/2016/wordml/cid" xmlns:w16="http://schemas.microsoft.com/office/word/2018/wordml" xmlns:w16du="http://schemas.microsoft.com/office/word/2023/wordml/word16du" xmlns:w16sdtdh="http://schemas.microsoft.com/office/word/2020/wordml/sdtdatahash" xmlns:w16sdtfl="http://schemas.microsoft.com/office/word/2024/wordml/sdtformatlock" xmlns:w16se="http://schemas.microsoft.com/office/word/2015/wordml/symex" mc:Ignorable="w14 w15 w16se w16cid w16 w16cex w16sdtdh w16sdtfl w16du">
   <w:docDefaults>
     <w:rPrDefault>
       <w:rPr>
@@ -3458,13 +3122,13 @@
     <w:qFormat/>
     <w:rsid w:val="009271A6"/>
   </w:style>
-  <w:style w:type="character" w:default="1" w:styleId="Fuentedeprrafopredeter">
+  <w:style w:type="character" w:default="1" w:styleId="DefaultParagraphFont">
     <w:name w:val="Default Paragraph Font"/>
     <w:uiPriority w:val="1"/>
     <w:semiHidden/>
     <w:unhideWhenUsed/>
   </w:style>
-  <w:style w:type="table" w:default="1" w:styleId="Tablanormal">
+  <w:style w:type="table" w:default="1" w:styleId="TableNormal">
     <w:name w:val="Normal Table"/>
     <w:uiPriority w:val="99"/>
     <w:semiHidden/>
@@ -3479,15 +3143,15 @@
       </w:tblCellMar>
     </w:tblPr>
   </w:style>
-  <w:style w:type="numbering" w:default="1" w:styleId="Sinlista">
+  <w:style w:type="numbering" w:default="1" w:styleId="NoList">
     <w:name w:val="No List"/>
     <w:uiPriority w:val="99"/>
     <w:semiHidden/>
     <w:unhideWhenUsed/>
   </w:style>
-  <w:style w:type="character" w:styleId="Hipervnculo">
+  <w:style w:type="character" w:styleId="Hyperlink">
     <w:name w:val="Hyperlink"/>
-    <w:basedOn w:val="Fuentedeprrafopredeter"/>
+    <w:basedOn w:val="DefaultParagraphFont"/>
     <w:uiPriority w:val="99"/>
     <w:unhideWhenUsed/>
     <w:rsid w:val="009271A6"/>
@@ -3496,9 +3160,9 @@
       <w:u w:val="single"/>
     </w:rPr>
   </w:style>
-  <w:style w:type="character" w:styleId="Mencinsinresolver">
+  <w:style w:type="character" w:styleId="UnresolvedMention">
     <w:name w:val="Unresolved Mention"/>
-    <w:basedOn w:val="Fuentedeprrafopredeter"/>
+    <w:basedOn w:val="DefaultParagraphFont"/>
     <w:uiPriority w:val="99"/>
     <w:semiHidden/>
     <w:unhideWhenUsed/>

</xml_diff>